<commit_message>
update - Bỏ Địa chỉ tạm trú trên hợp đồng
</commit_message>
<xml_diff>
--- a/static/uploads/mau/hopdong/nt1/o1_o2/hdcth.docx
+++ b/static/uploads/mau/hopdong/nt1/o1_o2/hdcth.docx
@@ -154,8 +154,18 @@
                 <w:b/>
                 <w:szCs w:val="24"/>
               </w:rPr>
-              <w:t xml:space="preserve"> phúc</w:t>
-            </w:r>
+              <w:t xml:space="preserve"> </w:t>
+            </w:r>
+            <w:proofErr w:type="spellStart"/>
+            <w:r>
+              <w:rPr>
+                <w:rFonts w:ascii="Times New Roman" w:hAnsi="Times New Roman"/>
+                <w:b/>
+                <w:szCs w:val="24"/>
+              </w:rPr>
+              <w:t>phúc</w:t>
+            </w:r>
+            <w:proofErr w:type="spellEnd"/>
           </w:p>
         </w:tc>
       </w:tr>
@@ -634,7 +644,17 @@
           <w:sz w:val="20"/>
           <w:szCs w:val="24"/>
         </w:rPr>
-        <w:t>-CP, TT 10/2020/TT-BL</w:t>
+        <w:t>-CP, TT 10/2020/TT-</w:t>
+      </w:r>
+      <w:proofErr w:type="gramStart"/>
+      <w:r>
+        <w:rPr>
+          <w:rFonts w:ascii="Times New Roman" w:hAnsi="Times New Roman"/>
+          <w:b w:val="0"/>
+          <w:sz w:val="20"/>
+          <w:szCs w:val="24"/>
+        </w:rPr>
+        <w:t>BL</w:t>
       </w:r>
       <w:r>
         <w:rPr>
@@ -654,6 +674,7 @@
         </w:rPr>
         <w:t>TBXH )</w:t>
       </w:r>
+      <w:proofErr w:type="gramEnd"/>
     </w:p>
     <w:p>
       <w:pPr>
@@ -2529,116 +2550,6 @@
                 <w:szCs w:val="24"/>
                 <w:lang w:val="nl-NL"/>
               </w:rPr>
-              <w:t>Địa chỉ cư trú</w:t>
-            </w:r>
-          </w:p>
-        </w:tc>
-        <w:tc>
-          <w:tcPr>
-            <w:tcW w:w="284" w:type="dxa"/>
-          </w:tcPr>
-          <w:p>
-            <w:pPr>
-              <w:tabs>
-                <w:tab w:val="left" w:pos="3402"/>
-                <w:tab w:val="left" w:pos="6804"/>
-              </w:tabs>
-              <w:ind w:left="0" w:firstLine="0"/>
-              <w:rPr>
-                <w:rFonts w:ascii="Times New Roman" w:hAnsi="Times New Roman"/>
-                <w:color w:val="000000"/>
-                <w:szCs w:val="24"/>
-                <w:lang w:val="nl-NL"/>
-              </w:rPr>
-            </w:pPr>
-            <w:r>
-              <w:rPr>
-                <w:rFonts w:ascii="Times New Roman" w:hAnsi="Times New Roman"/>
-                <w:color w:val="000000"/>
-                <w:szCs w:val="24"/>
-                <w:lang w:val="nl-NL"/>
-              </w:rPr>
-              <w:t>:</w:t>
-            </w:r>
-          </w:p>
-        </w:tc>
-        <w:tc>
-          <w:tcPr>
-            <w:tcW w:w="7928" w:type="dxa"/>
-            <w:gridSpan w:val="5"/>
-          </w:tcPr>
-          <w:p>
-            <w:pPr>
-              <w:spacing w:before="0" w:after="0"/>
-              <w:ind w:left="0" w:firstLine="0"/>
-              <w:rPr>
-                <w:rFonts w:ascii="Times New Roman" w:hAnsi="Times New Roman"/>
-                <w:color w:val="000000"/>
-                <w:szCs w:val="24"/>
-                <w:lang w:val="nl-NL"/>
-              </w:rPr>
-            </w:pPr>
-            <w:r>
-              <w:rPr>
-                <w:rFonts w:ascii="Times New Roman" w:hAnsi="Times New Roman"/>
-                <w:noProof/>
-                <w:color w:val="000000"/>
-                <w:szCs w:val="24"/>
-                <w:lang w:val="nl-NL"/>
-              </w:rPr>
-              <w:t>{{</w:t>
-            </w:r>
-            <w:r>
-              <w:rPr>
-                <w:rFonts w:ascii="Times New Roman" w:hAnsi="Times New Roman"/>
-                <w:noProof/>
-                <w:color w:val="000000"/>
-                <w:szCs w:val="24"/>
-              </w:rPr>
-              <w:t>tamtru</w:t>
-            </w:r>
-            <w:r>
-              <w:rPr>
-                <w:rFonts w:ascii="Times New Roman" w:hAnsi="Times New Roman"/>
-                <w:noProof/>
-                <w:color w:val="000000"/>
-                <w:szCs w:val="24"/>
-                <w:lang w:val="nl-NL"/>
-              </w:rPr>
-              <w:t>}}</w:t>
-            </w:r>
-          </w:p>
-        </w:tc>
-      </w:tr>
-      <w:tr>
-        <w:trPr>
-          <w:trHeight w:val="504"/>
-        </w:trPr>
-        <w:tc>
-          <w:tcPr>
-            <w:tcW w:w="2457" w:type="dxa"/>
-          </w:tcPr>
-          <w:p>
-            <w:pPr>
-              <w:tabs>
-                <w:tab w:val="left" w:pos="3402"/>
-                <w:tab w:val="left" w:pos="6804"/>
-              </w:tabs>
-              <w:ind w:left="0" w:firstLine="0"/>
-              <w:rPr>
-                <w:rFonts w:ascii="Times New Roman" w:hAnsi="Times New Roman"/>
-                <w:color w:val="000000"/>
-                <w:szCs w:val="24"/>
-                <w:lang w:val="nl-NL"/>
-              </w:rPr>
-            </w:pPr>
-            <w:r>
-              <w:rPr>
-                <w:rFonts w:ascii="Times New Roman" w:hAnsi="Times New Roman"/>
-                <w:color w:val="000000"/>
-                <w:szCs w:val="24"/>
-                <w:lang w:val="nl-NL"/>
-              </w:rPr>
               <w:t>Số CMND/CCCD</w:t>
             </w:r>
           </w:p>
@@ -3070,6 +2981,7 @@
           <w:p>
             <w:pPr>
               <w:ind w:left="0" w:firstLine="0"/>
+              <w:jc w:val="left"/>
               <w:rPr>
                 <w:rFonts w:ascii="Times New Roman" w:hAnsi="Times New Roman"/>
                 <w:szCs w:val="24"/>
@@ -3735,6 +3647,7 @@
               <w:t xml:space="preserve"> Nam </w:t>
             </w:r>
             <w:proofErr w:type="spellStart"/>
+            <w:proofErr w:type="gramStart"/>
             <w:r>
               <w:rPr>
                 <w:rFonts w:ascii="Times New Roman" w:hAnsi="Times New Roman"/>
@@ -3752,6 +3665,7 @@
               </w:rPr>
               <w:t>:</w:t>
             </w:r>
+            <w:proofErr w:type="gramEnd"/>
             <w:r>
               <w:rPr>
                 <w:rFonts w:ascii="Times New Roman" w:hAnsi="Times New Roman"/>
@@ -3976,6 +3890,7 @@
                 <w:szCs w:val="24"/>
                 <w:lang w:val="fr-FR"/>
               </w:rPr>
+              <w:lastRenderedPageBreak/>
               <w:t xml:space="preserve">+ </w:t>
             </w:r>
             <w:proofErr w:type="spellStart"/>
@@ -5256,8 +5171,21 @@
           <w:u w:val="single"/>
           <w:lang w:val="fr-FR"/>
         </w:rPr>
-        <w:t>ĐIỀU 2:</w:t>
-      </w:r>
+        <w:t xml:space="preserve">ĐIỀU </w:t>
+      </w:r>
+      <w:proofErr w:type="gramStart"/>
+      <w:r>
+        <w:rPr>
+          <w:rFonts w:ascii="Times New Roman" w:hAnsi="Times New Roman"/>
+          <w:b/>
+          <w:bCs/>
+          <w:szCs w:val="24"/>
+          <w:u w:val="single"/>
+          <w:lang w:val="fr-FR"/>
+        </w:rPr>
+        <w:t>2:</w:t>
+      </w:r>
+      <w:proofErr w:type="gramEnd"/>
       <w:r>
         <w:rPr>
           <w:rFonts w:ascii="Times New Roman" w:hAnsi="Times New Roman"/>
@@ -5552,6 +5480,7 @@
         <w:t xml:space="preserve"> </w:t>
       </w:r>
       <w:proofErr w:type="spellStart"/>
+      <w:proofErr w:type="gramStart"/>
       <w:r>
         <w:rPr>
           <w:rFonts w:ascii="Times New Roman" w:hAnsi="Times New Roman"/>
@@ -5567,7 +5496,16 @@
           <w:szCs w:val="24"/>
           <w:lang w:val="fr-FR"/>
         </w:rPr>
-        <w:t xml:space="preserve">: Theo </w:t>
+        <w:t>:</w:t>
+      </w:r>
+      <w:proofErr w:type="gramEnd"/>
+      <w:r>
+        <w:rPr>
+          <w:rFonts w:ascii="Times New Roman" w:hAnsi="Times New Roman"/>
+          <w:szCs w:val="24"/>
+          <w:lang w:val="fr-FR"/>
+        </w:rPr>
+        <w:t xml:space="preserve"> Theo </w:t>
       </w:r>
       <w:proofErr w:type="spellStart"/>
       <w:r>
@@ -6008,6 +5946,7 @@
         <w:t xml:space="preserve"> </w:t>
       </w:r>
       <w:proofErr w:type="spellStart"/>
+      <w:proofErr w:type="gramStart"/>
       <w:r>
         <w:rPr>
           <w:rFonts w:ascii="Times New Roman" w:hAnsi="Times New Roman"/>
@@ -6023,7 +5962,16 @@
           <w:szCs w:val="24"/>
           <w:lang w:val="fr-FR"/>
         </w:rPr>
-        <w:t xml:space="preserve">: Theo </w:t>
+        <w:t>:</w:t>
+      </w:r>
+      <w:proofErr w:type="gramEnd"/>
+      <w:r>
+        <w:rPr>
+          <w:rFonts w:ascii="Times New Roman" w:hAnsi="Times New Roman"/>
+          <w:szCs w:val="24"/>
+          <w:lang w:val="fr-FR"/>
+        </w:rPr>
+        <w:t xml:space="preserve"> Theo </w:t>
       </w:r>
       <w:proofErr w:type="spellStart"/>
       <w:r>
@@ -6245,8 +6193,21 @@
           <w:u w:val="single"/>
           <w:lang w:val="fr-FR"/>
         </w:rPr>
-        <w:t>ĐIỀU 3:</w:t>
-      </w:r>
+        <w:t xml:space="preserve">ĐIỀU </w:t>
+      </w:r>
+      <w:proofErr w:type="gramStart"/>
+      <w:r>
+        <w:rPr>
+          <w:rFonts w:ascii="Times New Roman" w:hAnsi="Times New Roman"/>
+          <w:b/>
+          <w:bCs/>
+          <w:szCs w:val="24"/>
+          <w:u w:val="single"/>
+          <w:lang w:val="fr-FR"/>
+        </w:rPr>
+        <w:t>3:</w:t>
+      </w:r>
+      <w:proofErr w:type="gramEnd"/>
       <w:r>
         <w:rPr>
           <w:rFonts w:ascii="Times New Roman" w:hAnsi="Times New Roman"/>
@@ -7269,6 +7230,7 @@
           <w:szCs w:val="24"/>
           <w:lang w:val="nl-NL"/>
         </w:rPr>
+        <w:lastRenderedPageBreak/>
         <w:t>3.6</w:t>
       </w:r>
       <w:r>
@@ -7327,7 +7289,6 @@
           <w:szCs w:val="24"/>
           <w:lang w:val="nl-NL"/>
         </w:rPr>
-        <w:lastRenderedPageBreak/>
         <w:t xml:space="preserve">  - Người lao động được cấp phát trang thiết bị bảo hộ lao động theo chính sách cấp phát bảo hộ lao động của công ty.</w:t>
       </w:r>
       <w:r>
@@ -8364,6 +8325,7 @@
           <w:szCs w:val="24"/>
           <w:lang w:val="nl-NL"/>
         </w:rPr>
+        <w:lastRenderedPageBreak/>
         <w:t>- Tuyển dụng, bố trí, điều hành, điều chuyển lao động theo nhu cầu sản xuất, kinh doanh.</w:t>
       </w:r>
       <w:r>
@@ -8391,7 +8353,6 @@
           <w:szCs w:val="24"/>
           <w:lang w:val="nl-NL"/>
         </w:rPr>
-        <w:lastRenderedPageBreak/>
         <w:t>- Có quyền tạm hoãn, chấm dứt hợp đồng lao động, kỷ luật người lao động theo quy định của pháp luật, thỏa ước lao động tập thể và nội quy Công ty.</w:t>
       </w:r>
     </w:p>
@@ -10090,13 +10051,11 @@
     <w:p/>
     <w:p/>
     <w:p/>
-    <w:p/>
-    <w:p/>
-    <w:p/>
-    <w:p/>
-    <w:p/>
-    <w:p/>
-    <w:p/>
+    <w:p>
+      <w:pPr>
+        <w:ind w:left="0" w:firstLine="0"/>
+      </w:pPr>
+    </w:p>
     <w:sectPr>
       <w:footerReference w:type="even" r:id="rId10"/>
       <w:footerReference w:type="default" r:id="rId11"/>
@@ -11114,6 +11073,12 @@
   <wne:recipientData>
     <wne:active wne:val="1"/>
     <wne:hash wne:val="1707048493"/>
+  </wne:recipientData>
+  <wne:recipientData>
+    <wne:active wne:val="1"/>
+  </wne:recipientData>
+  <wne:recipientData>
+    <wne:active wne:val="1"/>
   </wne:recipientData>
   <wne:recipientData>
     <wne:active wne:val="1"/>

</xml_diff>

<commit_message>
fix: mẫu hợp đồng mới + bảng công tổng hợp đúng template mới
</commit_message>
<xml_diff>
--- a/static/uploads/mau/hopdong/nt1/o1_o2/hdcth.docx
+++ b/static/uploads/mau/hopdong/nt1/o1_o2/hdcth.docx
@@ -154,8 +154,18 @@
                 <w:b/>
                 <w:szCs w:val="24"/>
               </w:rPr>
-              <w:t xml:space="preserve"> phúc</w:t>
-            </w:r>
+              <w:t xml:space="preserve"> </w:t>
+            </w:r>
+            <w:proofErr w:type="spellStart"/>
+            <w:r>
+              <w:rPr>
+                <w:rFonts w:ascii="Times New Roman" w:hAnsi="Times New Roman"/>
+                <w:b/>
+                <w:szCs w:val="24"/>
+              </w:rPr>
+              <w:t>phúc</w:t>
+            </w:r>
+            <w:proofErr w:type="spellEnd"/>
           </w:p>
         </w:tc>
       </w:tr>
@@ -583,7 +593,17 @@
           <w:sz w:val="20"/>
           <w:szCs w:val="24"/>
         </w:rPr>
-        <w:t>-CP, TT 10/2020/TT-BL</w:t>
+        <w:t>-CP, TT 10/2020/TT-</w:t>
+      </w:r>
+      <w:proofErr w:type="gramStart"/>
+      <w:r>
+        <w:rPr>
+          <w:rFonts w:ascii="Times New Roman" w:hAnsi="Times New Roman"/>
+          <w:b w:val="0"/>
+          <w:sz w:val="20"/>
+          <w:szCs w:val="24"/>
+        </w:rPr>
+        <w:t>BL</w:t>
       </w:r>
       <w:r>
         <w:rPr>
@@ -603,19 +623,7 @@
         </w:rPr>
         <w:t>TBXH )</w:t>
       </w:r>
-    </w:p>
-    <w:p>
-      <w:pPr>
-        <w:tabs>
-          <w:tab w:val="left" w:pos="6390"/>
-        </w:tabs>
-        <w:ind w:left="270"/>
-        <w:rPr>
-          <w:rFonts w:ascii="Times New Roman" w:hAnsi="Times New Roman"/>
-          <w:i/>
-          <w:szCs w:val="24"/>
-        </w:rPr>
-      </w:pPr>
+      <w:proofErr w:type="gramEnd"/>
     </w:p>
     <w:tbl>
       <w:tblPr>
@@ -962,7 +970,7 @@
       </w:tr>
       <w:tr>
         <w:trPr>
-          <w:trHeight w:val="732"/>
+          <w:trHeight w:val="522"/>
         </w:trPr>
         <w:tc>
           <w:tcPr>
@@ -1193,7 +1201,7 @@
       </w:tr>
       <w:tr>
         <w:trPr>
-          <w:trHeight w:val="600"/>
+          <w:trHeight w:val="450"/>
         </w:trPr>
         <w:tc>
           <w:tcPr>
@@ -1336,7 +1344,7 @@
       </w:tr>
       <w:tr>
         <w:trPr>
-          <w:trHeight w:val="748"/>
+          <w:trHeight w:val="360"/>
         </w:trPr>
         <w:tc>
           <w:tcPr>
@@ -2959,13 +2967,33 @@
                 <w:szCs w:val="24"/>
                 <w:lang w:val="fr-FR"/>
               </w:rPr>
-              <w:t>{{ngaylamhopdong}}</w:t>
-            </w:r>
+              <w:t>{{</w:t>
+            </w:r>
+            <w:proofErr w:type="spellStart"/>
             <w:r>
               <w:rPr>
                 <w:rFonts w:ascii="Times New Roman" w:hAnsi="Times New Roman"/>
                 <w:i/>
                 <w:szCs w:val="24"/>
+                <w:lang w:val="fr-FR"/>
+              </w:rPr>
+              <w:t>ngaylamhopdong</w:t>
+            </w:r>
+            <w:proofErr w:type="spellEnd"/>
+            <w:r>
+              <w:rPr>
+                <w:rFonts w:ascii="Times New Roman" w:hAnsi="Times New Roman"/>
+                <w:i/>
+                <w:szCs w:val="24"/>
+                <w:lang w:val="fr-FR"/>
+              </w:rPr>
+              <w:t>}}</w:t>
+            </w:r>
+            <w:r>
+              <w:rPr>
+                <w:rFonts w:ascii="Times New Roman" w:hAnsi="Times New Roman"/>
+                <w:i/>
+                <w:szCs w:val="24"/>
                 <w:lang w:val="vi-VN"/>
               </w:rPr>
               <w:t xml:space="preserve"> </w:t>
@@ -2986,13 +3014,33 @@
                 <w:szCs w:val="24"/>
                 <w:lang w:val="fr-FR"/>
               </w:rPr>
-              <w:t>{{thanglamhopdong}}</w:t>
-            </w:r>
+              <w:t>{{</w:t>
+            </w:r>
+            <w:proofErr w:type="spellStart"/>
             <w:r>
               <w:rPr>
                 <w:rFonts w:ascii="Times New Roman" w:hAnsi="Times New Roman"/>
                 <w:i/>
                 <w:szCs w:val="24"/>
+                <w:lang w:val="fr-FR"/>
+              </w:rPr>
+              <w:t>thanglamhopdong</w:t>
+            </w:r>
+            <w:proofErr w:type="spellEnd"/>
+            <w:r>
+              <w:rPr>
+                <w:rFonts w:ascii="Times New Roman" w:hAnsi="Times New Roman"/>
+                <w:i/>
+                <w:szCs w:val="24"/>
+                <w:lang w:val="fr-FR"/>
+              </w:rPr>
+              <w:t>}}</w:t>
+            </w:r>
+            <w:r>
+              <w:rPr>
+                <w:rFonts w:ascii="Times New Roman" w:hAnsi="Times New Roman"/>
+                <w:i/>
+                <w:szCs w:val="24"/>
                 <w:lang w:val="vi-VN"/>
               </w:rPr>
               <w:t xml:space="preserve"> năm </w:t>
@@ -3004,11 +3052,31 @@
                 <w:szCs w:val="24"/>
                 <w:lang w:val="fr-FR"/>
               </w:rPr>
-              <w:t xml:space="preserve">{{namlamhopdong}} </w:t>
+              <w:t>{{</w:t>
             </w:r>
             <w:proofErr w:type="spellStart"/>
             <w:r>
               <w:rPr>
+                <w:rFonts w:ascii="Times New Roman" w:hAnsi="Times New Roman"/>
+                <w:i/>
+                <w:szCs w:val="24"/>
+                <w:lang w:val="fr-FR"/>
+              </w:rPr>
+              <w:t>namlamhopdong</w:t>
+            </w:r>
+            <w:proofErr w:type="spellEnd"/>
+            <w:r>
+              <w:rPr>
+                <w:rFonts w:ascii="Times New Roman" w:hAnsi="Times New Roman"/>
+                <w:i/>
+                <w:szCs w:val="24"/>
+                <w:lang w:val="fr-FR"/>
+              </w:rPr>
+              <w:t xml:space="preserve">}} </w:t>
+            </w:r>
+            <w:proofErr w:type="spellStart"/>
+            <w:r>
+              <w:rPr>
                 <w:rFonts w:ascii="Times New Roman" w:hAnsi="Times New Roman" w:hint="eastAsia"/>
                 <w:szCs w:val="24"/>
                 <w:lang w:val="fr-FR"/>
@@ -3075,13 +3143,33 @@
                 <w:szCs w:val="24"/>
                 <w:lang w:val="fr-FR"/>
               </w:rPr>
-              <w:t>{{ngayketthuchopdong}}</w:t>
-            </w:r>
+              <w:t>{{</w:t>
+            </w:r>
+            <w:proofErr w:type="spellStart"/>
             <w:r>
               <w:rPr>
                 <w:rFonts w:ascii="Times New Roman" w:hAnsi="Times New Roman"/>
                 <w:i/>
                 <w:szCs w:val="24"/>
+                <w:lang w:val="fr-FR"/>
+              </w:rPr>
+              <w:t>ngayketthuchopdong</w:t>
+            </w:r>
+            <w:proofErr w:type="spellEnd"/>
+            <w:r>
+              <w:rPr>
+                <w:rFonts w:ascii="Times New Roman" w:hAnsi="Times New Roman"/>
+                <w:i/>
+                <w:szCs w:val="24"/>
+                <w:lang w:val="fr-FR"/>
+              </w:rPr>
+              <w:t>}}</w:t>
+            </w:r>
+            <w:r>
+              <w:rPr>
+                <w:rFonts w:ascii="Times New Roman" w:hAnsi="Times New Roman"/>
+                <w:i/>
+                <w:szCs w:val="24"/>
                 <w:lang w:val="vi-VN"/>
               </w:rPr>
               <w:t xml:space="preserve"> </w:t>
@@ -3102,13 +3190,33 @@
                 <w:szCs w:val="24"/>
                 <w:lang w:val="fr-FR"/>
               </w:rPr>
-              <w:t>{{thangketthuchopdong}}</w:t>
-            </w:r>
+              <w:t>{{</w:t>
+            </w:r>
+            <w:proofErr w:type="spellStart"/>
             <w:r>
               <w:rPr>
                 <w:rFonts w:ascii="Times New Roman" w:hAnsi="Times New Roman"/>
                 <w:i/>
                 <w:szCs w:val="24"/>
+                <w:lang w:val="fr-FR"/>
+              </w:rPr>
+              <w:t>thangketthuchopdong</w:t>
+            </w:r>
+            <w:proofErr w:type="spellEnd"/>
+            <w:r>
+              <w:rPr>
+                <w:rFonts w:ascii="Times New Roman" w:hAnsi="Times New Roman"/>
+                <w:i/>
+                <w:szCs w:val="24"/>
+                <w:lang w:val="fr-FR"/>
+              </w:rPr>
+              <w:t>}}</w:t>
+            </w:r>
+            <w:r>
+              <w:rPr>
+                <w:rFonts w:ascii="Times New Roman" w:hAnsi="Times New Roman"/>
+                <w:i/>
+                <w:szCs w:val="24"/>
                 <w:lang w:val="vi-VN"/>
               </w:rPr>
               <w:t xml:space="preserve"> năm </w:t>
@@ -3120,7 +3228,27 @@
                 <w:szCs w:val="24"/>
                 <w:lang w:val="fr-FR"/>
               </w:rPr>
-              <w:t>{{namketthuchopdong}}</w:t>
+              <w:t>{{</w:t>
+            </w:r>
+            <w:proofErr w:type="spellStart"/>
+            <w:r>
+              <w:rPr>
+                <w:rFonts w:ascii="Times New Roman" w:hAnsi="Times New Roman"/>
+                <w:i/>
+                <w:szCs w:val="24"/>
+                <w:lang w:val="fr-FR"/>
+              </w:rPr>
+              <w:t>namketthuchopdong</w:t>
+            </w:r>
+            <w:proofErr w:type="spellEnd"/>
+            <w:r>
+              <w:rPr>
+                <w:rFonts w:ascii="Times New Roman" w:hAnsi="Times New Roman"/>
+                <w:i/>
+                <w:szCs w:val="24"/>
+                <w:lang w:val="fr-FR"/>
+              </w:rPr>
+              <w:t>}}</w:t>
             </w:r>
           </w:p>
         </w:tc>
@@ -3362,6 +3490,24 @@
                 <w:szCs w:val="24"/>
                 <w:lang w:val="fr-FR"/>
               </w:rPr>
+              <w:t xml:space="preserve"> Công </w:t>
+            </w:r>
+            <w:proofErr w:type="spellStart"/>
+            <w:r>
+              <w:rPr>
+                <w:rFonts w:ascii="Times New Roman" w:hAnsi="Times New Roman"/>
+                <w:szCs w:val="24"/>
+                <w:lang w:val="fr-FR"/>
+              </w:rPr>
+              <w:t>ty</w:t>
+            </w:r>
+            <w:proofErr w:type="spellEnd"/>
+            <w:r>
+              <w:rPr>
+                <w:rFonts w:ascii="Times New Roman" w:hAnsi="Times New Roman"/>
+                <w:szCs w:val="24"/>
+                <w:lang w:val="fr-FR"/>
+              </w:rPr>
               <w:t xml:space="preserve"> </w:t>
             </w:r>
             <w:proofErr w:type="spellStart"/>
@@ -3371,7 +3517,7 @@
                 <w:szCs w:val="24"/>
                 <w:lang w:val="fr-FR"/>
               </w:rPr>
-              <w:t>Công</w:t>
+              <w:t>Cổ</w:t>
             </w:r>
             <w:proofErr w:type="spellEnd"/>
             <w:r>
@@ -3389,7 +3535,7 @@
                 <w:szCs w:val="24"/>
                 <w:lang w:val="fr-FR"/>
               </w:rPr>
-              <w:t>ty</w:t>
+              <w:t>phần</w:t>
             </w:r>
             <w:proofErr w:type="spellEnd"/>
             <w:r>
@@ -3407,7 +3553,7 @@
                 <w:szCs w:val="24"/>
                 <w:lang w:val="fr-FR"/>
               </w:rPr>
-              <w:t>Cổ</w:t>
+              <w:t>Sản</w:t>
             </w:r>
             <w:proofErr w:type="spellEnd"/>
             <w:r>
@@ -3425,7 +3571,7 @@
                 <w:szCs w:val="24"/>
                 <w:lang w:val="fr-FR"/>
               </w:rPr>
-              <w:t>phần</w:t>
+              <w:t>xuất</w:t>
             </w:r>
             <w:proofErr w:type="spellEnd"/>
             <w:r>
@@ -3434,16 +3580,17 @@
                 <w:szCs w:val="24"/>
                 <w:lang w:val="fr-FR"/>
               </w:rPr>
-              <w:t xml:space="preserve"> </w:t>
+              <w:t xml:space="preserve"> Nam </w:t>
             </w:r>
             <w:proofErr w:type="spellStart"/>
-            <w:r>
-              <w:rPr>
-                <w:rFonts w:ascii="Times New Roman" w:hAnsi="Times New Roman"/>
-                <w:szCs w:val="24"/>
-                <w:lang w:val="fr-FR"/>
-              </w:rPr>
-              <w:t>Sản</w:t>
+            <w:proofErr w:type="gramStart"/>
+            <w:r>
+              <w:rPr>
+                <w:rFonts w:ascii="Times New Roman" w:hAnsi="Times New Roman"/>
+                <w:szCs w:val="24"/>
+                <w:lang w:val="fr-FR"/>
+              </w:rPr>
+              <w:t>Thuận</w:t>
             </w:r>
             <w:proofErr w:type="spellEnd"/>
             <w:r>
@@ -3452,44 +3599,9 @@
                 <w:szCs w:val="24"/>
                 <w:lang w:val="fr-FR"/>
               </w:rPr>
-              <w:t xml:space="preserve"> </w:t>
-            </w:r>
-            <w:proofErr w:type="spellStart"/>
-            <w:r>
-              <w:rPr>
-                <w:rFonts w:ascii="Times New Roman" w:hAnsi="Times New Roman"/>
-                <w:szCs w:val="24"/>
-                <w:lang w:val="fr-FR"/>
-              </w:rPr>
-              <w:t>xuất</w:t>
-            </w:r>
-            <w:proofErr w:type="spellEnd"/>
-            <w:r>
-              <w:rPr>
-                <w:rFonts w:ascii="Times New Roman" w:hAnsi="Times New Roman"/>
-                <w:szCs w:val="24"/>
-                <w:lang w:val="fr-FR"/>
-              </w:rPr>
-              <w:t xml:space="preserve"> Nam </w:t>
-            </w:r>
-            <w:proofErr w:type="spellStart"/>
-            <w:r>
-              <w:rPr>
-                <w:rFonts w:ascii="Times New Roman" w:hAnsi="Times New Roman"/>
-                <w:szCs w:val="24"/>
-                <w:lang w:val="fr-FR"/>
-              </w:rPr>
-              <w:t>Thuận</w:t>
-            </w:r>
-            <w:proofErr w:type="spellEnd"/>
-            <w:r>
-              <w:rPr>
-                <w:rFonts w:ascii="Times New Roman" w:hAnsi="Times New Roman"/>
-                <w:szCs w:val="24"/>
-                <w:lang w:val="fr-FR"/>
-              </w:rPr>
               <w:t>:</w:t>
             </w:r>
+            <w:proofErr w:type="gramEnd"/>
             <w:r>
               <w:rPr>
                 <w:rFonts w:ascii="Times New Roman" w:hAnsi="Times New Roman"/>
@@ -3578,6 +3690,24 @@
                 <w:szCs w:val="24"/>
                 <w:lang w:val="fr-FR"/>
               </w:rPr>
+              <w:t xml:space="preserve"> Sơn 7, </w:t>
+            </w:r>
+            <w:proofErr w:type="spellStart"/>
+            <w:r>
+              <w:rPr>
+                <w:rFonts w:ascii="Times New Roman" w:hAnsi="Times New Roman"/>
+                <w:szCs w:val="24"/>
+                <w:lang w:val="fr-FR"/>
+              </w:rPr>
+              <w:t>phường</w:t>
+            </w:r>
+            <w:proofErr w:type="spellEnd"/>
+            <w:r>
+              <w:rPr>
+                <w:rFonts w:ascii="Times New Roman" w:hAnsi="Times New Roman"/>
+                <w:szCs w:val="24"/>
+                <w:lang w:val="fr-FR"/>
+              </w:rPr>
               <w:t xml:space="preserve"> </w:t>
             </w:r>
             <w:proofErr w:type="spellStart"/>
@@ -3587,7 +3717,7 @@
                 <w:szCs w:val="24"/>
                 <w:lang w:val="fr-FR"/>
               </w:rPr>
-              <w:t>Sơn</w:t>
+              <w:t>Thủy</w:t>
             </w:r>
             <w:proofErr w:type="spellEnd"/>
             <w:r>
@@ -3596,7 +3726,7 @@
                 <w:szCs w:val="24"/>
                 <w:lang w:val="fr-FR"/>
               </w:rPr>
-              <w:t xml:space="preserve"> 7, </w:t>
+              <w:t xml:space="preserve"> Nguyên, </w:t>
             </w:r>
             <w:proofErr w:type="spellStart"/>
             <w:r>
@@ -3605,7 +3735,7 @@
                 <w:szCs w:val="24"/>
                 <w:lang w:val="fr-FR"/>
               </w:rPr>
-              <w:t>phường</w:t>
+              <w:t>thành</w:t>
             </w:r>
             <w:proofErr w:type="spellEnd"/>
             <w:r>
@@ -3623,7 +3753,7 @@
                 <w:szCs w:val="24"/>
                 <w:lang w:val="fr-FR"/>
               </w:rPr>
-              <w:t>Thủy</w:t>
+              <w:t>phố</w:t>
             </w:r>
             <w:proofErr w:type="spellEnd"/>
             <w:r>
@@ -3632,61 +3762,7 @@
                 <w:szCs w:val="24"/>
                 <w:lang w:val="fr-FR"/>
               </w:rPr>
-              <w:t xml:space="preserve"> Nguyên, </w:t>
-            </w:r>
-            <w:proofErr w:type="spellStart"/>
-            <w:r>
-              <w:rPr>
-                <w:rFonts w:ascii="Times New Roman" w:hAnsi="Times New Roman"/>
-                <w:szCs w:val="24"/>
-                <w:lang w:val="fr-FR"/>
-              </w:rPr>
-              <w:t>thành</w:t>
-            </w:r>
-            <w:proofErr w:type="spellEnd"/>
-            <w:r>
-              <w:rPr>
-                <w:rFonts w:ascii="Times New Roman" w:hAnsi="Times New Roman"/>
-                <w:szCs w:val="24"/>
-                <w:lang w:val="fr-FR"/>
-              </w:rPr>
-              <w:t xml:space="preserve"> </w:t>
-            </w:r>
-            <w:proofErr w:type="spellStart"/>
-            <w:r>
-              <w:rPr>
-                <w:rFonts w:ascii="Times New Roman" w:hAnsi="Times New Roman"/>
-                <w:szCs w:val="24"/>
-                <w:lang w:val="fr-FR"/>
-              </w:rPr>
-              <w:t>phố</w:t>
-            </w:r>
-            <w:proofErr w:type="spellEnd"/>
-            <w:r>
-              <w:rPr>
-                <w:rFonts w:ascii="Times New Roman" w:hAnsi="Times New Roman"/>
-                <w:szCs w:val="24"/>
-                <w:lang w:val="fr-FR"/>
-              </w:rPr>
-              <w:t xml:space="preserve"> </w:t>
-            </w:r>
-            <w:proofErr w:type="spellStart"/>
-            <w:r>
-              <w:rPr>
-                <w:rFonts w:ascii="Times New Roman" w:hAnsi="Times New Roman"/>
-                <w:szCs w:val="24"/>
-                <w:lang w:val="fr-FR"/>
-              </w:rPr>
-              <w:t>Hải</w:t>
-            </w:r>
-            <w:proofErr w:type="spellEnd"/>
-            <w:r>
-              <w:rPr>
-                <w:rFonts w:ascii="Times New Roman" w:hAnsi="Times New Roman"/>
-                <w:szCs w:val="24"/>
-                <w:lang w:val="fr-FR"/>
-              </w:rPr>
-              <w:t xml:space="preserve"> </w:t>
+              <w:t xml:space="preserve"> Hải </w:t>
             </w:r>
             <w:proofErr w:type="spellStart"/>
             <w:r>
@@ -3714,8 +3790,7 @@
                 <w:szCs w:val="24"/>
                 <w:lang w:val="fr-FR"/>
               </w:rPr>
-              <w:lastRenderedPageBreak/>
-              <w:t xml:space="preserve">+ </w:t>
+              <w:t xml:space="preserve">+ Các </w:t>
             </w:r>
             <w:proofErr w:type="spellStart"/>
             <w:r>
@@ -3724,7 +3799,7 @@
                 <w:szCs w:val="24"/>
                 <w:lang w:val="fr-FR"/>
               </w:rPr>
-              <w:t>Các</w:t>
+              <w:t>địa</w:t>
             </w:r>
             <w:proofErr w:type="spellEnd"/>
             <w:r>
@@ -3742,7 +3817,7 @@
                 <w:szCs w:val="24"/>
                 <w:lang w:val="fr-FR"/>
               </w:rPr>
-              <w:t>địa</w:t>
+              <w:t>điểm</w:t>
             </w:r>
             <w:proofErr w:type="spellEnd"/>
             <w:r>
@@ -3760,7 +3835,7 @@
                 <w:szCs w:val="24"/>
                 <w:lang w:val="fr-FR"/>
               </w:rPr>
-              <w:t>điểm</w:t>
+              <w:t>khác</w:t>
             </w:r>
             <w:proofErr w:type="spellEnd"/>
             <w:r>
@@ -3778,7 +3853,7 @@
                 <w:szCs w:val="24"/>
                 <w:lang w:val="fr-FR"/>
               </w:rPr>
-              <w:t>khác</w:t>
+              <w:t>theo</w:t>
             </w:r>
             <w:proofErr w:type="spellEnd"/>
             <w:r>
@@ -3796,7 +3871,7 @@
                 <w:szCs w:val="24"/>
                 <w:lang w:val="fr-FR"/>
               </w:rPr>
-              <w:t>theo</w:t>
+              <w:t>sự</w:t>
             </w:r>
             <w:proofErr w:type="spellEnd"/>
             <w:r>
@@ -3814,7 +3889,7 @@
                 <w:szCs w:val="24"/>
                 <w:lang w:val="fr-FR"/>
               </w:rPr>
-              <w:t>sự</w:t>
+              <w:t>phân</w:t>
             </w:r>
             <w:proofErr w:type="spellEnd"/>
             <w:r>
@@ -3832,7 +3907,7 @@
                 <w:szCs w:val="24"/>
                 <w:lang w:val="fr-FR"/>
               </w:rPr>
-              <w:t>phân</w:t>
+              <w:t>công</w:t>
             </w:r>
             <w:proofErr w:type="spellEnd"/>
             <w:r>
@@ -3850,7 +3925,7 @@
                 <w:szCs w:val="24"/>
                 <w:lang w:val="fr-FR"/>
               </w:rPr>
-              <w:t>công</w:t>
+              <w:t>của</w:t>
             </w:r>
             <w:proofErr w:type="spellEnd"/>
             <w:r>
@@ -3859,43 +3934,7 @@
                 <w:szCs w:val="24"/>
                 <w:lang w:val="fr-FR"/>
               </w:rPr>
-              <w:t xml:space="preserve"> </w:t>
-            </w:r>
-            <w:proofErr w:type="spellStart"/>
-            <w:r>
-              <w:rPr>
-                <w:rFonts w:ascii="Times New Roman" w:hAnsi="Times New Roman"/>
-                <w:szCs w:val="24"/>
-                <w:lang w:val="fr-FR"/>
-              </w:rPr>
-              <w:t>của</w:t>
-            </w:r>
-            <w:proofErr w:type="spellEnd"/>
-            <w:r>
-              <w:rPr>
-                <w:rFonts w:ascii="Times New Roman" w:hAnsi="Times New Roman"/>
-                <w:szCs w:val="24"/>
-                <w:lang w:val="fr-FR"/>
-              </w:rPr>
-              <w:t xml:space="preserve"> </w:t>
-            </w:r>
-            <w:proofErr w:type="spellStart"/>
-            <w:r>
-              <w:rPr>
-                <w:rFonts w:ascii="Times New Roman" w:hAnsi="Times New Roman"/>
-                <w:szCs w:val="24"/>
-                <w:lang w:val="fr-FR"/>
-              </w:rPr>
-              <w:t>Công</w:t>
-            </w:r>
-            <w:proofErr w:type="spellEnd"/>
-            <w:r>
-              <w:rPr>
-                <w:rFonts w:ascii="Times New Roman" w:hAnsi="Times New Roman"/>
-                <w:szCs w:val="24"/>
-                <w:lang w:val="fr-FR"/>
-              </w:rPr>
-              <w:t xml:space="preserve"> </w:t>
+              <w:t xml:space="preserve"> Công </w:t>
             </w:r>
             <w:proofErr w:type="spellStart"/>
             <w:r>
@@ -4995,8 +5034,32 @@
           <w:u w:val="single"/>
           <w:lang w:val="fr-FR"/>
         </w:rPr>
-        <w:t>ĐIỀU 2:</w:t>
-      </w:r>
+        <w:t xml:space="preserve"> </w:t>
+      </w:r>
+      <w:r>
+        <w:rPr>
+          <w:rFonts w:ascii="Times New Roman" w:hAnsi="Times New Roman"/>
+          <w:b/>
+          <w:bCs/>
+          <w:szCs w:val="24"/>
+          <w:u w:val="single"/>
+          <w:lang w:val="fr-FR"/>
+        </w:rPr>
+        <w:t xml:space="preserve">ĐIỀU </w:t>
+      </w:r>
+      <w:proofErr w:type="gramStart"/>
+      <w:r>
+        <w:rPr>
+          <w:rFonts w:ascii="Times New Roman" w:hAnsi="Times New Roman"/>
+          <w:b/>
+          <w:bCs/>
+          <w:szCs w:val="24"/>
+          <w:u w:val="single"/>
+          <w:lang w:val="fr-FR"/>
+        </w:rPr>
+        <w:t>2:</w:t>
+      </w:r>
+      <w:proofErr w:type="gramEnd"/>
       <w:r>
         <w:rPr>
           <w:rFonts w:ascii="Times New Roman" w:hAnsi="Times New Roman"/>
@@ -5291,6 +5354,7 @@
         <w:t xml:space="preserve"> </w:t>
       </w:r>
       <w:proofErr w:type="spellStart"/>
+      <w:proofErr w:type="gramStart"/>
       <w:r>
         <w:rPr>
           <w:rFonts w:ascii="Times New Roman" w:hAnsi="Times New Roman"/>
@@ -5306,7 +5370,16 @@
           <w:szCs w:val="24"/>
           <w:lang w:val="fr-FR"/>
         </w:rPr>
-        <w:t xml:space="preserve">: Theo </w:t>
+        <w:t>:</w:t>
+      </w:r>
+      <w:proofErr w:type="gramEnd"/>
+      <w:r>
+        <w:rPr>
+          <w:rFonts w:ascii="Times New Roman" w:hAnsi="Times New Roman"/>
+          <w:szCs w:val="24"/>
+          <w:lang w:val="fr-FR"/>
+        </w:rPr>
+        <w:t xml:space="preserve"> Theo </w:t>
       </w:r>
       <w:proofErr w:type="spellStart"/>
       <w:r>
@@ -5747,6 +5820,7 @@
         <w:t xml:space="preserve"> </w:t>
       </w:r>
       <w:proofErr w:type="spellStart"/>
+      <w:proofErr w:type="gramStart"/>
       <w:r>
         <w:rPr>
           <w:rFonts w:ascii="Times New Roman" w:hAnsi="Times New Roman"/>
@@ -5762,7 +5836,16 @@
           <w:szCs w:val="24"/>
           <w:lang w:val="fr-FR"/>
         </w:rPr>
-        <w:t xml:space="preserve">: Theo </w:t>
+        <w:t>:</w:t>
+      </w:r>
+      <w:proofErr w:type="gramEnd"/>
+      <w:r>
+        <w:rPr>
+          <w:rFonts w:ascii="Times New Roman" w:hAnsi="Times New Roman"/>
+          <w:szCs w:val="24"/>
+          <w:lang w:val="fr-FR"/>
+        </w:rPr>
+        <w:t xml:space="preserve"> Theo </w:t>
       </w:r>
       <w:proofErr w:type="spellStart"/>
       <w:r>
@@ -5984,8 +6067,32 @@
           <w:u w:val="single"/>
           <w:lang w:val="fr-FR"/>
         </w:rPr>
-        <w:t>ĐIỀU 3:</w:t>
-      </w:r>
+        <w:t xml:space="preserve"> </w:t>
+      </w:r>
+      <w:r>
+        <w:rPr>
+          <w:rFonts w:ascii="Times New Roman" w:hAnsi="Times New Roman"/>
+          <w:b/>
+          <w:bCs/>
+          <w:szCs w:val="24"/>
+          <w:u w:val="single"/>
+          <w:lang w:val="fr-FR"/>
+        </w:rPr>
+        <w:t xml:space="preserve">ĐIỀU </w:t>
+      </w:r>
+      <w:proofErr w:type="gramStart"/>
+      <w:r>
+        <w:rPr>
+          <w:rFonts w:ascii="Times New Roman" w:hAnsi="Times New Roman"/>
+          <w:b/>
+          <w:bCs/>
+          <w:szCs w:val="24"/>
+          <w:u w:val="single"/>
+          <w:lang w:val="fr-FR"/>
+        </w:rPr>
+        <w:t>3:</w:t>
+      </w:r>
+      <w:proofErr w:type="gramEnd"/>
       <w:r>
         <w:rPr>
           <w:rFonts w:ascii="Times New Roman" w:hAnsi="Times New Roman"/>
@@ -7008,7 +7115,6 @@
           <w:szCs w:val="24"/>
           <w:lang w:val="nl-NL"/>
         </w:rPr>
-        <w:lastRenderedPageBreak/>
         <w:t>3.6</w:t>
       </w:r>
       <w:r>
@@ -7151,6 +7257,7 @@
           <w:szCs w:val="24"/>
           <w:lang w:val="nl-NL"/>
         </w:rPr>
+        <w:lastRenderedPageBreak/>
         <w:t xml:space="preserve">  - </w:t>
       </w:r>
       <w:r>
@@ -7381,10 +7488,10 @@
     </w:p>
     <w:p>
       <w:pPr>
-        <w:ind w:left="527" w:right="-284" w:hanging="170"/>
-        <w:rPr>
-          <w:rFonts w:ascii="Times New Roman" w:hAnsi="Times New Roman"/>
-          <w:color w:val="000000"/>
+        <w:ind w:left="540" w:hanging="180"/>
+        <w:rPr>
+          <w:rFonts w:ascii="Times New Roman" w:hAnsi="Times New Roman"/>
+          <w:bCs/>
           <w:szCs w:val="24"/>
           <w:lang w:val="nl-NL"/>
         </w:rPr>
@@ -7401,6 +7508,7 @@
       <w:r>
         <w:rPr>
           <w:rFonts w:ascii="Times New Roman" w:hAnsi="Times New Roman"/>
+          <w:bCs/>
           <w:szCs w:val="24"/>
           <w:lang w:val="nl-NL"/>
         </w:rPr>
@@ -7418,7 +7526,7 @@
       <w:r>
         <w:rPr>
           <w:rFonts w:ascii="Times New Roman" w:hAnsi="Times New Roman"/>
-          <w:color w:val="000000"/>
+          <w:bCs/>
           <w:szCs w:val="24"/>
           <w:lang w:val="nl-NL"/>
         </w:rPr>
@@ -7610,16 +7718,7 @@
           <w:szCs w:val="24"/>
           <w:lang w:val="nl-NL"/>
         </w:rPr>
-        <w:t xml:space="preserve">- Hoàn thành công việc được giao, thực hiện theo sự phân công yêu cầu của bộ phận, người quản lý. </w:t>
-      </w:r>
-      <w:r>
-        <w:rPr>
-          <w:rFonts w:ascii="Times New Roman" w:hAnsi="Times New Roman"/>
-          <w:bCs/>
-          <w:szCs w:val="24"/>
-          <w:lang w:val="nl-NL"/>
-        </w:rPr>
-        <w:tab/>
+        <w:t>- Hoàn thành công việc được giao, thực hiện theo sự phân công yêu cầu của bộ phận, người quản lý.</w:t>
       </w:r>
       <w:r>
         <w:rPr>
@@ -7993,14 +8092,36 @@
     </w:p>
     <w:p>
       <w:pPr>
-        <w:ind w:left="641" w:hanging="284"/>
-        <w:rPr>
-          <w:rFonts w:ascii="Times New Roman" w:hAnsi="Times New Roman"/>
-          <w:bCs/>
-          <w:szCs w:val="24"/>
-          <w:lang w:val="nl-NL"/>
-        </w:rPr>
-      </w:pPr>
+        <w:ind w:left="900" w:hanging="540"/>
+        <w:rPr>
+          <w:rFonts w:ascii="Times New Roman" w:hAnsi="Times New Roman"/>
+          <w:b/>
+          <w:bCs/>
+          <w:szCs w:val="24"/>
+          <w:lang w:val="nl-NL"/>
+        </w:rPr>
+      </w:pPr>
+      <w:r>
+        <w:rPr>
+          <w:rFonts w:ascii="Times New Roman" w:hAnsi="Times New Roman"/>
+          <w:b/>
+          <w:bCs/>
+          <w:szCs w:val="24"/>
+          <w:u w:val="single"/>
+          <w:lang w:val="nl-NL"/>
+        </w:rPr>
+        <w:t>ĐIỀU 5:</w:t>
+      </w:r>
+      <w:r>
+        <w:rPr>
+          <w:rFonts w:ascii="Times New Roman" w:hAnsi="Times New Roman"/>
+          <w:b/>
+          <w:bCs/>
+          <w:szCs w:val="24"/>
+          <w:lang w:val="nl-NL"/>
+        </w:rPr>
+        <w:t xml:space="preserve"> NGHĨA VỤ VÀ QUYỀN HẠN CỦA NGƯỜI SỬ DỤNG LAO ĐỘNG</w:t>
+      </w:r>
     </w:p>
     <w:p>
       <w:pPr>
@@ -8019,20 +8140,9 @@
           <w:b/>
           <w:bCs/>
           <w:szCs w:val="24"/>
-          <w:u w:val="single"/>
-          <w:lang w:val="nl-NL"/>
-        </w:rPr>
-        <w:t>ĐIỀU 5:</w:t>
-      </w:r>
-      <w:r>
-        <w:rPr>
-          <w:rFonts w:ascii="Times New Roman" w:hAnsi="Times New Roman"/>
-          <w:b/>
-          <w:bCs/>
-          <w:szCs w:val="24"/>
-          <w:lang w:val="nl-NL"/>
-        </w:rPr>
-        <w:t xml:space="preserve"> NGHĨA VỤ VÀ QUYỀN HẠN CỦA NGƯỜI SỬ DỤNG LAO ĐỘNG</w:t>
+          <w:lang w:val="nl-NL"/>
+        </w:rPr>
+        <w:t>5.1. Quyền hạn</w:t>
       </w:r>
     </w:p>
     <w:p>
@@ -8040,41 +8150,48 @@
         <w:ind w:left="900" w:hanging="540"/>
         <w:rPr>
           <w:rFonts w:ascii="Times New Roman" w:hAnsi="Times New Roman"/>
-          <w:b/>
-          <w:bCs/>
-          <w:szCs w:val="24"/>
-          <w:lang w:val="nl-NL"/>
-        </w:rPr>
-      </w:pPr>
-      <w:r>
-        <w:rPr>
-          <w:rFonts w:ascii="Times New Roman" w:hAnsi="Times New Roman"/>
-          <w:b/>
-          <w:bCs/>
-          <w:szCs w:val="24"/>
-          <w:lang w:val="nl-NL"/>
-        </w:rPr>
-        <w:t>5.1. Quyền hạn</w:t>
+          <w:bCs/>
+          <w:szCs w:val="24"/>
+          <w:lang w:val="nl-NL"/>
+        </w:rPr>
+      </w:pPr>
+      <w:r>
+        <w:rPr>
+          <w:rFonts w:ascii="Times New Roman" w:hAnsi="Times New Roman"/>
+          <w:bCs/>
+          <w:szCs w:val="24"/>
+          <w:lang w:val="nl-NL"/>
+        </w:rPr>
+        <w:t xml:space="preserve">Người sử dụng lao động có các quyền sau: </w:t>
+      </w:r>
+      <w:r>
+        <w:rPr>
+          <w:rFonts w:ascii="Times New Roman" w:hAnsi="Times New Roman"/>
+          <w:bCs/>
+          <w:szCs w:val="24"/>
+          <w:lang w:val="nl-NL"/>
+        </w:rPr>
+        <w:tab/>
       </w:r>
     </w:p>
     <w:p>
       <w:pPr>
-        <w:ind w:left="900" w:hanging="540"/>
-        <w:rPr>
-          <w:rFonts w:ascii="Times New Roman" w:hAnsi="Times New Roman"/>
-          <w:bCs/>
-          <w:szCs w:val="24"/>
-          <w:lang w:val="nl-NL"/>
-        </w:rPr>
-      </w:pPr>
-      <w:r>
-        <w:rPr>
-          <w:rFonts w:ascii="Times New Roman" w:hAnsi="Times New Roman"/>
-          <w:bCs/>
-          <w:szCs w:val="24"/>
-          <w:lang w:val="nl-NL"/>
-        </w:rPr>
-        <w:t xml:space="preserve">Người sử dụng lao động có các quyền sau: </w:t>
+        <w:ind w:left="540" w:hanging="180"/>
+        <w:rPr>
+          <w:rFonts w:ascii="Times New Roman" w:hAnsi="Times New Roman"/>
+          <w:bCs/>
+          <w:szCs w:val="24"/>
+          <w:lang w:val="nl-NL"/>
+        </w:rPr>
+      </w:pPr>
+      <w:r>
+        <w:rPr>
+          <w:rFonts w:ascii="Times New Roman" w:hAnsi="Times New Roman"/>
+          <w:bCs/>
+          <w:szCs w:val="24"/>
+          <w:lang w:val="nl-NL"/>
+        </w:rPr>
+        <w:t>- Tuyển dụng, bố trí, điều hành, điều chuyển lao động theo nhu cầu sản xuất, kinh doanh.</w:t>
       </w:r>
       <w:r>
         <w:rPr>
@@ -8091,29 +8208,17 @@
         <w:ind w:left="540" w:hanging="180"/>
         <w:rPr>
           <w:rFonts w:ascii="Times New Roman" w:hAnsi="Times New Roman"/>
-          <w:bCs/>
-          <w:szCs w:val="24"/>
-          <w:lang w:val="nl-NL"/>
-        </w:rPr>
-      </w:pPr>
-      <w:r>
-        <w:rPr>
-          <w:rFonts w:ascii="Times New Roman" w:hAnsi="Times New Roman"/>
-          <w:bCs/>
-          <w:szCs w:val="24"/>
-          <w:lang w:val="nl-NL"/>
-        </w:rPr>
-        <w:lastRenderedPageBreak/>
-        <w:t>- Tuyển dụng, bố trí, điều hành, điều chuyển lao động theo nhu cầu sản xuất, kinh doanh.</w:t>
-      </w:r>
-      <w:r>
-        <w:rPr>
-          <w:rFonts w:ascii="Times New Roman" w:hAnsi="Times New Roman"/>
-          <w:bCs/>
-          <w:szCs w:val="24"/>
-          <w:lang w:val="nl-NL"/>
-        </w:rPr>
-        <w:tab/>
+          <w:szCs w:val="24"/>
+          <w:lang w:val="nl-NL"/>
+        </w:rPr>
+      </w:pPr>
+      <w:r>
+        <w:rPr>
+          <w:rFonts w:ascii="Times New Roman" w:hAnsi="Times New Roman"/>
+          <w:szCs w:val="24"/>
+          <w:lang w:val="nl-NL"/>
+        </w:rPr>
+        <w:t>- Có quyền tạm hoãn, chấm dứt hợp đồng lao động, kỷ luật người lao động theo quy định của pháp luật, thỏa ước lao động tập thể và nội quy Công ty.</w:t>
       </w:r>
     </w:p>
     <w:p>
@@ -8131,7 +8236,7 @@
           <w:szCs w:val="24"/>
           <w:lang w:val="nl-NL"/>
         </w:rPr>
-        <w:t>- Có quyền tạm hoãn, chấm dứt hợp đồng lao động, kỷ luật người lao động theo quy định của pháp luật, thỏa ước lao động tập thể và nội quy Công ty.</w:t>
+        <w:t>- Thực hiện các quy định của pháp luật về lao động, pháp luật về bảo hiểm xã hội và pháp luật về bảo hiểm y tế.</w:t>
       </w:r>
     </w:p>
     <w:p>
@@ -8139,46 +8244,46 @@
         <w:ind w:left="540" w:hanging="180"/>
         <w:rPr>
           <w:rFonts w:ascii="Times New Roman" w:hAnsi="Times New Roman"/>
-          <w:szCs w:val="24"/>
-          <w:lang w:val="nl-NL"/>
-        </w:rPr>
-      </w:pPr>
-      <w:r>
-        <w:rPr>
-          <w:rFonts w:ascii="Times New Roman" w:hAnsi="Times New Roman"/>
-          <w:szCs w:val="24"/>
-          <w:lang w:val="nl-NL"/>
-        </w:rPr>
-        <w:t>- Thực hiện các quy định của pháp luật về lao động, pháp luật về bảo hiểm xã hội và pháp luật về bảo hiểm y tế.</w:t>
+          <w:b/>
+          <w:szCs w:val="24"/>
+          <w:lang w:val="nl-NL"/>
+        </w:rPr>
+      </w:pPr>
+      <w:r>
+        <w:rPr>
+          <w:rFonts w:ascii="Times New Roman" w:hAnsi="Times New Roman"/>
+          <w:b/>
+          <w:szCs w:val="24"/>
+          <w:lang w:val="nl-NL"/>
+        </w:rPr>
+        <w:t>5.2. Nghĩa vụ</w:t>
+      </w:r>
+      <w:r>
+        <w:rPr>
+          <w:rFonts w:ascii="Times New Roman" w:hAnsi="Times New Roman"/>
+          <w:b/>
+          <w:szCs w:val="24"/>
+          <w:lang w:val="nl-NL"/>
+        </w:rPr>
+        <w:tab/>
       </w:r>
     </w:p>
     <w:p>
       <w:pPr>
-        <w:ind w:left="540" w:hanging="180"/>
-        <w:rPr>
-          <w:rFonts w:ascii="Times New Roman" w:hAnsi="Times New Roman"/>
-          <w:b/>
-          <w:szCs w:val="24"/>
-          <w:lang w:val="nl-NL"/>
-        </w:rPr>
-      </w:pPr>
-      <w:r>
-        <w:rPr>
-          <w:rFonts w:ascii="Times New Roman" w:hAnsi="Times New Roman"/>
-          <w:b/>
-          <w:szCs w:val="24"/>
-          <w:lang w:val="nl-NL"/>
-        </w:rPr>
-        <w:t>5.2. Nghĩa vụ</w:t>
-      </w:r>
-      <w:r>
-        <w:rPr>
-          <w:rFonts w:ascii="Times New Roman" w:hAnsi="Times New Roman"/>
-          <w:b/>
-          <w:szCs w:val="24"/>
-          <w:lang w:val="nl-NL"/>
-        </w:rPr>
-        <w:tab/>
+        <w:ind w:left="641" w:hanging="284"/>
+        <w:rPr>
+          <w:rFonts w:ascii="Times New Roman" w:hAnsi="Times New Roman"/>
+          <w:szCs w:val="24"/>
+          <w:lang w:val="nl-NL"/>
+        </w:rPr>
+      </w:pPr>
+      <w:r>
+        <w:rPr>
+          <w:rFonts w:ascii="Times New Roman" w:hAnsi="Times New Roman"/>
+          <w:szCs w:val="24"/>
+          <w:lang w:val="nl-NL"/>
+        </w:rPr>
+        <w:t xml:space="preserve">  - Bảo đảm việc làm và thực hiện hợp đồng lao động, thoả ước lao động tập thể và thoả thuận khác với người lao động, tôn trọng danh dự, nhân phẩm của người lao động.</w:t>
       </w:r>
     </w:p>
     <w:p>
@@ -8196,1156 +8301,393 @@
           <w:szCs w:val="24"/>
           <w:lang w:val="nl-NL"/>
         </w:rPr>
-        <w:t xml:space="preserve">  - Bảo đảm việc làm và thực hiện hợp đồng lao động, thoả ước lao động tập thể và thoả thuận khác với người lao động, tôn trọng danh dự, nhân phẩm của người lao động.</w:t>
+        <w:lastRenderedPageBreak/>
+        <w:t xml:space="preserve">  - Chịu trách nhiệm thanh toán đầy đủ, đúng hạn các chế độ và quyền lợi cho người lao động theo hợp đồng lao động, thỏa ước lao động tập thể.</w:t>
+      </w:r>
+      <w:r>
+        <w:rPr>
+          <w:rFonts w:ascii="Times New Roman" w:hAnsi="Times New Roman"/>
+          <w:szCs w:val="24"/>
+          <w:lang w:val="nl-NL"/>
+        </w:rPr>
+        <w:tab/>
       </w:r>
     </w:p>
     <w:p>
       <w:pPr>
-        <w:ind w:left="641" w:hanging="284"/>
-        <w:rPr>
-          <w:rFonts w:ascii="Times New Roman" w:hAnsi="Times New Roman"/>
-          <w:szCs w:val="24"/>
-          <w:lang w:val="nl-NL"/>
-        </w:rPr>
-      </w:pPr>
-      <w:r>
-        <w:rPr>
-          <w:rFonts w:ascii="Times New Roman" w:hAnsi="Times New Roman"/>
-          <w:szCs w:val="24"/>
-          <w:lang w:val="nl-NL"/>
-        </w:rPr>
-        <w:t xml:space="preserve">  - Chịu trách nhiệm thanh toán đầy đủ, đúng hạn các chế độ và quyền lợi cho người lao động theo hợp đồng lao động, thỏa ước lao động tập thể.</w:t>
-      </w:r>
-      <w:r>
-        <w:rPr>
-          <w:rFonts w:ascii="Times New Roman" w:hAnsi="Times New Roman"/>
-          <w:szCs w:val="24"/>
-          <w:lang w:val="nl-NL"/>
-        </w:rPr>
-        <w:tab/>
+        <w:snapToGrid w:val="0"/>
+        <w:spacing w:after="0" w:line="264" w:lineRule="auto"/>
+        <w:ind w:left="0" w:firstLine="0"/>
+        <w:rPr>
+          <w:rFonts w:ascii="Times New Roman" w:hAnsi="Times New Roman"/>
+          <w:b/>
+          <w:szCs w:val="24"/>
+          <w:lang w:val="nl-NL"/>
+        </w:rPr>
+      </w:pPr>
+      <w:r>
+        <w:rPr>
+          <w:rFonts w:ascii="Times New Roman" w:hAnsi="Times New Roman"/>
+          <w:b/>
+          <w:szCs w:val="24"/>
+          <w:u w:val="single"/>
+          <w:lang w:val="nl-NL"/>
+        </w:rPr>
+        <w:t xml:space="preserve"> </w:t>
+      </w:r>
+      <w:r>
+        <w:rPr>
+          <w:rFonts w:ascii="Times New Roman" w:hAnsi="Times New Roman"/>
+          <w:b/>
+          <w:szCs w:val="24"/>
+          <w:u w:val="single"/>
+          <w:lang w:val="nl-NL"/>
+        </w:rPr>
+        <w:t>ĐIỀU 6:</w:t>
+      </w:r>
+      <w:r>
+        <w:rPr>
+          <w:rFonts w:ascii="Times New Roman" w:hAnsi="Times New Roman"/>
+          <w:b/>
+          <w:szCs w:val="24"/>
+          <w:lang w:val="nl-NL"/>
+        </w:rPr>
+        <w:t xml:space="preserve"> XỬ LÝ VÀ LƯU TRỮ DỮ LIỆU CÁ NHÂN CỦA NGƯỜI LAO ĐỘNG</w:t>
       </w:r>
     </w:p>
     <w:p>
       <w:pPr>
-        <w:ind w:left="641" w:hanging="284"/>
-        <w:rPr>
-          <w:rFonts w:ascii="Times New Roman" w:hAnsi="Times New Roman"/>
-          <w:b/>
-          <w:szCs w:val="24"/>
-          <w:lang w:val="nl-NL"/>
-        </w:rPr>
-      </w:pPr>
-      <w:r>
-        <w:rPr>
-          <w:rFonts w:ascii="Times New Roman" w:hAnsi="Times New Roman"/>
-          <w:b/>
-          <w:szCs w:val="24"/>
-          <w:u w:val="single"/>
-          <w:lang w:val="nl-NL"/>
-        </w:rPr>
-        <w:t>ĐIỀU 6:</w:t>
-      </w:r>
-      <w:r>
-        <w:rPr>
-          <w:rFonts w:ascii="Times New Roman" w:hAnsi="Times New Roman"/>
-          <w:b/>
-          <w:szCs w:val="24"/>
-          <w:lang w:val="nl-NL"/>
-        </w:rPr>
-        <w:t xml:space="preserve"> THỎA THUẬN KHÁC</w:t>
+        <w:pStyle w:val="ListParagraph"/>
+        <w:numPr>
+          <w:ilvl w:val="1"/>
+          <w:numId w:val="11"/>
+        </w:numPr>
+        <w:snapToGrid w:val="0"/>
+        <w:spacing w:after="0" w:line="264" w:lineRule="auto"/>
+        <w:ind w:left="426" w:hanging="426"/>
+        <w:contextualSpacing w:val="0"/>
+        <w:rPr>
+          <w:rFonts w:ascii="Times New Roman" w:hAnsi="Times New Roman"/>
+          <w:bCs/>
+          <w:szCs w:val="24"/>
+          <w:lang w:val="nl-NL"/>
+        </w:rPr>
+      </w:pPr>
+      <w:r>
+        <w:rPr>
+          <w:rFonts w:ascii="Times New Roman" w:hAnsi="Times New Roman"/>
+          <w:bCs/>
+          <w:szCs w:val="24"/>
+          <w:lang w:val="nl-NL"/>
+        </w:rPr>
+        <w:t>Người lao động đồng ý để Công ty thu thập, sử dụng, lưu trữ và xử lý dữ liệu cá nhân trong quá trình giao kết, thực hiện và sau khi chấm dứt Hợp đồng lao động, bao gồm thông tin, dữ liệu cá nhân cơ bản và thông tin, dữ liệu cá nhân nhạy cảm theo quy định pháp luật.</w:t>
       </w:r>
     </w:p>
     <w:p>
       <w:pPr>
-        <w:ind w:left="360" w:firstLine="0"/>
-        <w:rPr>
-          <w:rFonts w:ascii="Times New Roman" w:hAnsi="Times New Roman"/>
-          <w:szCs w:val="24"/>
-          <w:lang w:val="nl-NL"/>
-        </w:rPr>
-      </w:pPr>
-      <w:r>
-        <w:rPr>
-          <w:rFonts w:ascii="Times New Roman" w:hAnsi="Times New Roman"/>
-          <w:szCs w:val="24"/>
-          <w:lang w:val="nl-NL"/>
-        </w:rPr>
-        <w:t xml:space="preserve">- Công ty </w:t>
-      </w:r>
-      <w:r>
-        <w:rPr>
-          <w:rFonts w:ascii="Times New Roman" w:hAnsi="Times New Roman" w:hint="eastAsia"/>
-          <w:szCs w:val="24"/>
-          <w:lang w:val="nl-NL"/>
-        </w:rPr>
-        <w:t>đư</w:t>
-      </w:r>
-      <w:r>
-        <w:rPr>
-          <w:rFonts w:ascii="Times New Roman" w:hAnsi="Times New Roman"/>
-          <w:szCs w:val="24"/>
-          <w:lang w:val="nl-NL"/>
-        </w:rPr>
-        <w:t>ợc quyền chấm dứt H</w:t>
-      </w:r>
-      <w:r>
-        <w:rPr>
-          <w:rFonts w:ascii="Times New Roman" w:hAnsi="Times New Roman" w:hint="eastAsia"/>
-          <w:szCs w:val="24"/>
-          <w:lang w:val="nl-NL"/>
-        </w:rPr>
-        <w:t>Đ</w:t>
-      </w:r>
-      <w:r>
-        <w:rPr>
-          <w:rFonts w:ascii="Times New Roman" w:hAnsi="Times New Roman"/>
-          <w:szCs w:val="24"/>
-          <w:lang w:val="nl-NL"/>
-        </w:rPr>
-        <w:t>L</w:t>
-      </w:r>
-      <w:r>
-        <w:rPr>
-          <w:rFonts w:ascii="Times New Roman" w:hAnsi="Times New Roman" w:hint="eastAsia"/>
-          <w:szCs w:val="24"/>
-          <w:lang w:val="nl-NL"/>
-        </w:rPr>
-        <w:t>Đ</w:t>
-      </w:r>
-      <w:r>
-        <w:rPr>
-          <w:rFonts w:ascii="Times New Roman" w:hAnsi="Times New Roman"/>
-          <w:szCs w:val="24"/>
-          <w:lang w:val="nl-NL"/>
-        </w:rPr>
-        <w:t xml:space="preserve"> tr</w:t>
-      </w:r>
-      <w:r>
-        <w:rPr>
-          <w:rFonts w:ascii="Times New Roman" w:hAnsi="Times New Roman" w:hint="eastAsia"/>
-          <w:szCs w:val="24"/>
-          <w:lang w:val="nl-NL"/>
-        </w:rPr>
-        <w:t>ư</w:t>
-      </w:r>
-      <w:r>
-        <w:rPr>
-          <w:rFonts w:ascii="Times New Roman" w:hAnsi="Times New Roman"/>
-          <w:szCs w:val="24"/>
-          <w:lang w:val="nl-NL"/>
-        </w:rPr>
-        <w:t xml:space="preserve">ớc thời hạn </w:t>
-      </w:r>
-      <w:r>
-        <w:rPr>
-          <w:rFonts w:ascii="Times New Roman" w:hAnsi="Times New Roman" w:hint="eastAsia"/>
-          <w:szCs w:val="24"/>
-          <w:lang w:val="nl-NL"/>
-        </w:rPr>
-        <w:t>đ</w:t>
-      </w:r>
-      <w:r>
-        <w:rPr>
-          <w:rFonts w:ascii="Times New Roman" w:hAnsi="Times New Roman"/>
-          <w:szCs w:val="24"/>
-          <w:lang w:val="nl-NL"/>
-        </w:rPr>
-        <w:t>ối với Ng</w:t>
-      </w:r>
-      <w:r>
-        <w:rPr>
-          <w:rFonts w:ascii="Times New Roman" w:hAnsi="Times New Roman" w:hint="eastAsia"/>
-          <w:szCs w:val="24"/>
-          <w:lang w:val="nl-NL"/>
-        </w:rPr>
-        <w:t>ư</w:t>
-      </w:r>
-      <w:r>
-        <w:rPr>
-          <w:rFonts w:ascii="Times New Roman" w:hAnsi="Times New Roman"/>
-          <w:szCs w:val="24"/>
-          <w:lang w:val="nl-NL"/>
-        </w:rPr>
-        <w:t xml:space="preserve">ời lao </w:t>
-      </w:r>
-      <w:r>
-        <w:rPr>
-          <w:rFonts w:ascii="Times New Roman" w:hAnsi="Times New Roman" w:hint="eastAsia"/>
-          <w:szCs w:val="24"/>
-          <w:lang w:val="nl-NL"/>
-        </w:rPr>
-        <w:t>đ</w:t>
-      </w:r>
-      <w:r>
-        <w:rPr>
-          <w:rFonts w:ascii="Times New Roman" w:hAnsi="Times New Roman"/>
-          <w:szCs w:val="24"/>
-          <w:lang w:val="nl-NL"/>
-        </w:rPr>
-        <w:t xml:space="preserve">ộng có kết quả </w:t>
-      </w:r>
-      <w:r>
-        <w:rPr>
-          <w:rFonts w:ascii="Times New Roman" w:hAnsi="Times New Roman" w:hint="eastAsia"/>
-          <w:szCs w:val="24"/>
-          <w:lang w:val="nl-NL"/>
-        </w:rPr>
-        <w:t>đá</w:t>
-      </w:r>
-      <w:r>
-        <w:rPr>
-          <w:rFonts w:ascii="Times New Roman" w:hAnsi="Times New Roman"/>
-          <w:szCs w:val="24"/>
-          <w:lang w:val="nl-NL"/>
-        </w:rPr>
-        <w:t>nh giá hiệu suất công việc d</w:t>
-      </w:r>
-      <w:r>
-        <w:rPr>
-          <w:rFonts w:ascii="Times New Roman" w:hAnsi="Times New Roman" w:hint="eastAsia"/>
-          <w:szCs w:val="24"/>
-          <w:lang w:val="nl-NL"/>
-        </w:rPr>
-        <w:t>ư</w:t>
-      </w:r>
-      <w:r>
-        <w:rPr>
-          <w:rFonts w:ascii="Times New Roman" w:hAnsi="Times New Roman"/>
-          <w:szCs w:val="24"/>
-          <w:lang w:val="nl-NL"/>
-        </w:rPr>
-        <w:t xml:space="preserve">ới mức quy </w:t>
-      </w:r>
-      <w:r>
-        <w:rPr>
-          <w:rFonts w:ascii="Times New Roman" w:hAnsi="Times New Roman" w:hint="eastAsia"/>
-          <w:szCs w:val="24"/>
-          <w:lang w:val="nl-NL"/>
-        </w:rPr>
-        <w:t>đ</w:t>
-      </w:r>
-      <w:r>
-        <w:rPr>
-          <w:rFonts w:ascii="Times New Roman" w:hAnsi="Times New Roman"/>
-          <w:szCs w:val="24"/>
-          <w:lang w:val="nl-NL"/>
-        </w:rPr>
-        <w:t>ịnh trong 03 tháng liên tục.</w:t>
-      </w:r>
-      <w:r>
-        <w:rPr>
-          <w:rFonts w:ascii="Times New Roman" w:hAnsi="Times New Roman"/>
-          <w:szCs w:val="24"/>
-          <w:lang w:val="nl-NL"/>
-        </w:rPr>
-        <w:tab/>
-      </w:r>
-      <w:r>
-        <w:rPr>
-          <w:rFonts w:ascii="Times New Roman" w:hAnsi="Times New Roman"/>
-          <w:szCs w:val="24"/>
-          <w:lang w:val="nl-NL"/>
-        </w:rPr>
-        <w:tab/>
-      </w:r>
-      <w:r>
-        <w:rPr>
-          <w:rFonts w:ascii="Times New Roman" w:hAnsi="Times New Roman"/>
-          <w:szCs w:val="24"/>
-          <w:lang w:val="nl-NL"/>
-        </w:rPr>
-        <w:tab/>
-      </w:r>
-      <w:r>
-        <w:rPr>
-          <w:rFonts w:ascii="Times New Roman" w:hAnsi="Times New Roman"/>
-          <w:szCs w:val="24"/>
-          <w:lang w:val="nl-NL"/>
-        </w:rPr>
-        <w:tab/>
+        <w:pStyle w:val="ListParagraph"/>
+        <w:numPr>
+          <w:ilvl w:val="1"/>
+          <w:numId w:val="11"/>
+        </w:numPr>
+        <w:snapToGrid w:val="0"/>
+        <w:spacing w:after="0" w:line="264" w:lineRule="auto"/>
+        <w:ind w:left="426" w:hanging="426"/>
+        <w:contextualSpacing w:val="0"/>
+        <w:rPr>
+          <w:rFonts w:ascii="Times New Roman" w:hAnsi="Times New Roman"/>
+          <w:bCs/>
+          <w:szCs w:val="24"/>
+          <w:lang w:val="nl-NL"/>
+        </w:rPr>
+      </w:pPr>
+      <w:r>
+        <w:rPr>
+          <w:rFonts w:ascii="Times New Roman" w:hAnsi="Times New Roman"/>
+          <w:bCs/>
+          <w:szCs w:val="24"/>
+          <w:lang w:val="nl-NL"/>
+        </w:rPr>
+        <w:t>Việc xử lý và lưu trữ dữ liệu cá nhân được thực hiện nhằm các mục đích sau:</w:t>
       </w:r>
     </w:p>
     <w:p>
       <w:pPr>
-        <w:ind w:left="360" w:firstLine="0"/>
-        <w:rPr>
-          <w:rFonts w:ascii="Times New Roman" w:hAnsi="Times New Roman"/>
-          <w:szCs w:val="24"/>
-          <w:lang w:val="nl-NL"/>
-        </w:rPr>
-      </w:pPr>
-      <w:r>
-        <w:rPr>
-          <w:rFonts w:ascii="Times New Roman" w:hAnsi="Times New Roman"/>
-          <w:szCs w:val="24"/>
-          <w:lang w:val="nl-NL"/>
-        </w:rPr>
-        <w:t xml:space="preserve">- Trong quá trình thực hiện hợp </w:t>
-      </w:r>
-      <w:r>
-        <w:rPr>
-          <w:rFonts w:ascii="Times New Roman" w:hAnsi="Times New Roman" w:hint="eastAsia"/>
-          <w:szCs w:val="24"/>
-          <w:lang w:val="nl-NL"/>
-        </w:rPr>
-        <w:t>đ</w:t>
-      </w:r>
-      <w:r>
-        <w:rPr>
-          <w:rFonts w:ascii="Times New Roman" w:hAnsi="Times New Roman"/>
-          <w:szCs w:val="24"/>
-          <w:lang w:val="nl-NL"/>
-        </w:rPr>
-        <w:t xml:space="preserve">ồng nếu một bên có nhu cầu thay </w:t>
-      </w:r>
-      <w:r>
-        <w:rPr>
-          <w:rFonts w:ascii="Times New Roman" w:hAnsi="Times New Roman" w:hint="eastAsia"/>
-          <w:szCs w:val="24"/>
-          <w:lang w:val="nl-NL"/>
-        </w:rPr>
-        <w:t>đ</w:t>
-      </w:r>
-      <w:r>
-        <w:rPr>
-          <w:rFonts w:ascii="Times New Roman" w:hAnsi="Times New Roman"/>
-          <w:szCs w:val="24"/>
-          <w:lang w:val="nl-NL"/>
-        </w:rPr>
-        <w:t xml:space="preserve">ổi nội dung trong hợp </w:t>
-      </w:r>
-      <w:r>
-        <w:rPr>
-          <w:rFonts w:ascii="Times New Roman" w:hAnsi="Times New Roman" w:hint="eastAsia"/>
-          <w:szCs w:val="24"/>
-          <w:lang w:val="nl-NL"/>
-        </w:rPr>
-        <w:t>đ</w:t>
-      </w:r>
-      <w:r>
-        <w:rPr>
-          <w:rFonts w:ascii="Times New Roman" w:hAnsi="Times New Roman"/>
-          <w:szCs w:val="24"/>
-          <w:lang w:val="nl-NL"/>
-        </w:rPr>
-        <w:t>ồng phải báo cho bên kia tr</w:t>
-      </w:r>
-      <w:r>
-        <w:rPr>
-          <w:rFonts w:ascii="Times New Roman" w:hAnsi="Times New Roman" w:hint="eastAsia"/>
-          <w:szCs w:val="24"/>
-          <w:lang w:val="nl-NL"/>
-        </w:rPr>
-        <w:t>ư</w:t>
-      </w:r>
-      <w:r>
-        <w:rPr>
-          <w:rFonts w:ascii="Times New Roman" w:hAnsi="Times New Roman"/>
-          <w:szCs w:val="24"/>
-          <w:lang w:val="nl-NL"/>
-        </w:rPr>
-        <w:t xml:space="preserve">ớc ít nhất 03 ngày và ký kết bản Phụ lục hợp </w:t>
-      </w:r>
-      <w:r>
-        <w:rPr>
-          <w:rFonts w:ascii="Times New Roman" w:hAnsi="Times New Roman" w:hint="eastAsia"/>
-          <w:szCs w:val="24"/>
-          <w:lang w:val="nl-NL"/>
-        </w:rPr>
-        <w:t>đ</w:t>
-      </w:r>
-      <w:r>
-        <w:rPr>
-          <w:rFonts w:ascii="Times New Roman" w:hAnsi="Times New Roman"/>
-          <w:szCs w:val="24"/>
-          <w:lang w:val="nl-NL"/>
-        </w:rPr>
-        <w:t xml:space="preserve">ồng theo quy </w:t>
-      </w:r>
-      <w:r>
-        <w:rPr>
-          <w:rFonts w:ascii="Times New Roman" w:hAnsi="Times New Roman" w:hint="eastAsia"/>
-          <w:szCs w:val="24"/>
-          <w:lang w:val="nl-NL"/>
-        </w:rPr>
-        <w:t>đ</w:t>
-      </w:r>
-      <w:r>
-        <w:rPr>
-          <w:rFonts w:ascii="Times New Roman" w:hAnsi="Times New Roman"/>
-          <w:szCs w:val="24"/>
-          <w:lang w:val="nl-NL"/>
-        </w:rPr>
-        <w:t xml:space="preserve">ịnh của Pháp luật. Trong thời gian tiến hành thỏa thuận hai bên vẫn tuân theo hợp </w:t>
-      </w:r>
-      <w:r>
-        <w:rPr>
-          <w:rFonts w:ascii="Times New Roman" w:hAnsi="Times New Roman" w:hint="eastAsia"/>
-          <w:szCs w:val="24"/>
-          <w:lang w:val="nl-NL"/>
-        </w:rPr>
-        <w:t>đ</w:t>
-      </w:r>
-      <w:r>
-        <w:rPr>
-          <w:rFonts w:ascii="Times New Roman" w:hAnsi="Times New Roman"/>
-          <w:szCs w:val="24"/>
-          <w:lang w:val="nl-NL"/>
-        </w:rPr>
-        <w:t xml:space="preserve">ồng lao </w:t>
-      </w:r>
-      <w:r>
-        <w:rPr>
-          <w:rFonts w:ascii="Times New Roman" w:hAnsi="Times New Roman" w:hint="eastAsia"/>
-          <w:szCs w:val="24"/>
-          <w:lang w:val="nl-NL"/>
-        </w:rPr>
-        <w:t>đ</w:t>
-      </w:r>
-      <w:r>
-        <w:rPr>
-          <w:rFonts w:ascii="Times New Roman" w:hAnsi="Times New Roman"/>
-          <w:szCs w:val="24"/>
-          <w:lang w:val="nl-NL"/>
-        </w:rPr>
-        <w:t xml:space="preserve">ộng </w:t>
-      </w:r>
-      <w:r>
-        <w:rPr>
-          <w:rFonts w:ascii="Times New Roman" w:hAnsi="Times New Roman" w:hint="eastAsia"/>
-          <w:szCs w:val="24"/>
-          <w:lang w:val="nl-NL"/>
-        </w:rPr>
-        <w:t>đã</w:t>
-      </w:r>
-      <w:r>
-        <w:rPr>
-          <w:rFonts w:ascii="Times New Roman" w:hAnsi="Times New Roman"/>
-          <w:szCs w:val="24"/>
-          <w:lang w:val="nl-NL"/>
-        </w:rPr>
-        <w:t xml:space="preserve"> ký kết.</w:t>
-      </w:r>
-      <w:r>
-        <w:rPr>
-          <w:rFonts w:ascii="Times New Roman" w:hAnsi="Times New Roman"/>
-          <w:szCs w:val="24"/>
-          <w:lang w:val="nl-NL"/>
-        </w:rPr>
-        <w:tab/>
-      </w:r>
-      <w:r>
-        <w:rPr>
-          <w:rFonts w:ascii="Times New Roman" w:hAnsi="Times New Roman"/>
-          <w:szCs w:val="24"/>
-          <w:lang w:val="nl-NL"/>
-        </w:rPr>
-        <w:tab/>
-      </w:r>
-      <w:r>
-        <w:rPr>
-          <w:rFonts w:ascii="Times New Roman" w:hAnsi="Times New Roman"/>
-          <w:szCs w:val="24"/>
-          <w:lang w:val="nl-NL"/>
-        </w:rPr>
-        <w:tab/>
-      </w:r>
-      <w:r>
-        <w:rPr>
-          <w:rFonts w:ascii="Times New Roman" w:hAnsi="Times New Roman"/>
-          <w:szCs w:val="24"/>
-          <w:lang w:val="nl-NL"/>
-        </w:rPr>
-        <w:tab/>
-      </w:r>
-      <w:r>
-        <w:rPr>
-          <w:rFonts w:ascii="Times New Roman" w:hAnsi="Times New Roman"/>
-          <w:szCs w:val="24"/>
-          <w:lang w:val="nl-NL"/>
-        </w:rPr>
-        <w:tab/>
-      </w:r>
-      <w:r>
-        <w:rPr>
-          <w:rFonts w:ascii="Times New Roman" w:hAnsi="Times New Roman"/>
-          <w:szCs w:val="24"/>
-          <w:lang w:val="nl-NL"/>
-        </w:rPr>
-        <w:tab/>
-      </w:r>
-      <w:r>
-        <w:rPr>
-          <w:rFonts w:ascii="Times New Roman" w:hAnsi="Times New Roman"/>
-          <w:szCs w:val="24"/>
-          <w:lang w:val="nl-NL"/>
-        </w:rPr>
-        <w:tab/>
-      </w:r>
-      <w:r>
-        <w:rPr>
-          <w:rFonts w:ascii="Times New Roman" w:hAnsi="Times New Roman"/>
-          <w:szCs w:val="24"/>
-          <w:lang w:val="nl-NL"/>
-        </w:rPr>
-        <w:tab/>
-      </w:r>
-      <w:r>
-        <w:rPr>
-          <w:rFonts w:ascii="Times New Roman" w:hAnsi="Times New Roman"/>
-          <w:szCs w:val="24"/>
-          <w:lang w:val="nl-NL"/>
-        </w:rPr>
-        <w:tab/>
-      </w:r>
-      <w:r>
-        <w:rPr>
-          <w:rFonts w:ascii="Times New Roman" w:hAnsi="Times New Roman"/>
-          <w:szCs w:val="24"/>
-          <w:lang w:val="nl-NL"/>
-        </w:rPr>
-        <w:tab/>
-      </w:r>
-      <w:r>
-        <w:rPr>
-          <w:rFonts w:ascii="Times New Roman" w:hAnsi="Times New Roman"/>
-          <w:szCs w:val="24"/>
-          <w:lang w:val="nl-NL"/>
-        </w:rPr>
-        <w:tab/>
+        <w:pStyle w:val="ListParagraph"/>
+        <w:numPr>
+          <w:ilvl w:val="0"/>
+          <w:numId w:val="8"/>
+        </w:numPr>
+        <w:snapToGrid w:val="0"/>
+        <w:spacing w:after="0" w:line="264" w:lineRule="auto"/>
+        <w:ind w:left="567" w:hanging="283"/>
+        <w:contextualSpacing w:val="0"/>
+        <w:rPr>
+          <w:rFonts w:ascii="Times New Roman" w:hAnsi="Times New Roman"/>
+          <w:bCs/>
+          <w:szCs w:val="24"/>
+          <w:lang w:val="nl-NL"/>
+        </w:rPr>
+      </w:pPr>
+      <w:r>
+        <w:rPr>
+          <w:rFonts w:ascii="Times New Roman" w:hAnsi="Times New Roman"/>
+          <w:bCs/>
+          <w:szCs w:val="24"/>
+          <w:lang w:val="nl-NL"/>
+        </w:rPr>
+        <w:t>Thực hiện nghĩa vụ theo quy định của pháp luật về lao động, bảo hiểm, thuế, kế toán, kiểm toán;</w:t>
       </w:r>
     </w:p>
     <w:p>
       <w:pPr>
-        <w:ind w:left="360" w:firstLine="0"/>
-        <w:rPr>
-          <w:rFonts w:ascii="Times New Roman" w:hAnsi="Times New Roman"/>
-          <w:szCs w:val="24"/>
-          <w:lang w:val="nl-NL"/>
-        </w:rPr>
-      </w:pPr>
-      <w:r>
-        <w:rPr>
-          <w:rFonts w:ascii="Times New Roman" w:hAnsi="Times New Roman"/>
-          <w:szCs w:val="24"/>
-          <w:lang w:val="nl-NL"/>
-        </w:rPr>
-        <w:t>- Ng</w:t>
-      </w:r>
-      <w:r>
-        <w:rPr>
-          <w:rFonts w:ascii="Times New Roman" w:hAnsi="Times New Roman" w:hint="eastAsia"/>
-          <w:szCs w:val="24"/>
-          <w:lang w:val="nl-NL"/>
-        </w:rPr>
-        <w:t>ư</w:t>
-      </w:r>
-      <w:r>
-        <w:rPr>
-          <w:rFonts w:ascii="Times New Roman" w:hAnsi="Times New Roman"/>
-          <w:szCs w:val="24"/>
-          <w:lang w:val="nl-NL"/>
-        </w:rPr>
-        <w:t xml:space="preserve">ời lao </w:t>
-      </w:r>
-      <w:r>
-        <w:rPr>
-          <w:rFonts w:ascii="Times New Roman" w:hAnsi="Times New Roman" w:hint="eastAsia"/>
-          <w:szCs w:val="24"/>
-          <w:lang w:val="nl-NL"/>
-        </w:rPr>
-        <w:t>đ</w:t>
-      </w:r>
-      <w:r>
-        <w:rPr>
-          <w:rFonts w:ascii="Times New Roman" w:hAnsi="Times New Roman"/>
-          <w:szCs w:val="24"/>
-          <w:lang w:val="nl-NL"/>
-        </w:rPr>
-        <w:t xml:space="preserve">ộng </w:t>
-      </w:r>
-      <w:r>
-        <w:rPr>
-          <w:rFonts w:ascii="Times New Roman" w:hAnsi="Times New Roman" w:hint="eastAsia"/>
-          <w:szCs w:val="24"/>
-          <w:lang w:val="nl-NL"/>
-        </w:rPr>
-        <w:t>đ</w:t>
-      </w:r>
-      <w:r>
-        <w:rPr>
-          <w:rFonts w:ascii="Times New Roman" w:hAnsi="Times New Roman"/>
-          <w:szCs w:val="24"/>
-          <w:lang w:val="nl-NL"/>
-        </w:rPr>
-        <w:t xml:space="preserve">ọc kỹ, hiểu rõ và cam kết thực hiện các </w:t>
-      </w:r>
-      <w:r>
-        <w:rPr>
-          <w:rFonts w:ascii="Times New Roman" w:hAnsi="Times New Roman" w:hint="eastAsia"/>
-          <w:szCs w:val="24"/>
-          <w:lang w:val="nl-NL"/>
-        </w:rPr>
-        <w:t>đ</w:t>
-      </w:r>
-      <w:r>
-        <w:rPr>
-          <w:rFonts w:ascii="Times New Roman" w:hAnsi="Times New Roman"/>
-          <w:szCs w:val="24"/>
-          <w:lang w:val="nl-NL"/>
-        </w:rPr>
-        <w:t xml:space="preserve">iều khoản và quy </w:t>
-      </w:r>
-      <w:r>
-        <w:rPr>
-          <w:rFonts w:ascii="Times New Roman" w:hAnsi="Times New Roman" w:hint="eastAsia"/>
-          <w:szCs w:val="24"/>
-          <w:lang w:val="nl-NL"/>
-        </w:rPr>
-        <w:t>đ</w:t>
-      </w:r>
-      <w:r>
-        <w:rPr>
-          <w:rFonts w:ascii="Times New Roman" w:hAnsi="Times New Roman"/>
-          <w:szCs w:val="24"/>
-          <w:lang w:val="nl-NL"/>
-        </w:rPr>
-        <w:t xml:space="preserve">ịnh ghi tại Hợp </w:t>
-      </w:r>
-      <w:r>
-        <w:rPr>
-          <w:rFonts w:ascii="Times New Roman" w:hAnsi="Times New Roman" w:hint="eastAsia"/>
-          <w:szCs w:val="24"/>
-          <w:lang w:val="nl-NL"/>
-        </w:rPr>
-        <w:t>đ</w:t>
-      </w:r>
-      <w:r>
-        <w:rPr>
-          <w:rFonts w:ascii="Times New Roman" w:hAnsi="Times New Roman"/>
-          <w:szCs w:val="24"/>
-          <w:lang w:val="nl-NL"/>
-        </w:rPr>
-        <w:t xml:space="preserve">ồng lao </w:t>
-      </w:r>
-      <w:r>
-        <w:rPr>
-          <w:rFonts w:ascii="Times New Roman" w:hAnsi="Times New Roman" w:hint="eastAsia"/>
-          <w:szCs w:val="24"/>
-          <w:lang w:val="nl-NL"/>
-        </w:rPr>
-        <w:t>đ</w:t>
-      </w:r>
-      <w:r>
-        <w:rPr>
-          <w:rFonts w:ascii="Times New Roman" w:hAnsi="Times New Roman"/>
-          <w:szCs w:val="24"/>
-          <w:lang w:val="nl-NL"/>
-        </w:rPr>
-        <w:t>ộng.</w:t>
-      </w:r>
-      <w:r>
-        <w:rPr>
-          <w:rFonts w:ascii="Times New Roman" w:hAnsi="Times New Roman"/>
-          <w:szCs w:val="24"/>
-          <w:lang w:val="nl-NL"/>
-        </w:rPr>
-        <w:tab/>
-      </w:r>
-      <w:r>
-        <w:rPr>
-          <w:rFonts w:ascii="Times New Roman" w:hAnsi="Times New Roman"/>
-          <w:szCs w:val="24"/>
-          <w:lang w:val="nl-NL"/>
-        </w:rPr>
-        <w:tab/>
-      </w:r>
-      <w:r>
-        <w:rPr>
-          <w:rFonts w:ascii="Times New Roman" w:hAnsi="Times New Roman"/>
-          <w:szCs w:val="24"/>
-          <w:lang w:val="nl-NL"/>
-        </w:rPr>
-        <w:tab/>
-      </w:r>
-      <w:r>
-        <w:rPr>
-          <w:rFonts w:ascii="Times New Roman" w:hAnsi="Times New Roman"/>
-          <w:szCs w:val="24"/>
-          <w:lang w:val="nl-NL"/>
-        </w:rPr>
-        <w:tab/>
-      </w:r>
-      <w:r>
-        <w:rPr>
-          <w:rFonts w:ascii="Times New Roman" w:hAnsi="Times New Roman"/>
-          <w:szCs w:val="24"/>
-          <w:lang w:val="nl-NL"/>
-        </w:rPr>
-        <w:tab/>
-      </w:r>
-      <w:r>
-        <w:rPr>
-          <w:rFonts w:ascii="Times New Roman" w:hAnsi="Times New Roman"/>
-          <w:szCs w:val="24"/>
-          <w:lang w:val="nl-NL"/>
-        </w:rPr>
-        <w:tab/>
-      </w:r>
-      <w:r>
-        <w:rPr>
-          <w:rFonts w:ascii="Times New Roman" w:hAnsi="Times New Roman"/>
-          <w:szCs w:val="24"/>
-          <w:lang w:val="nl-NL"/>
-        </w:rPr>
-        <w:tab/>
-      </w:r>
-      <w:r>
-        <w:rPr>
-          <w:rFonts w:ascii="Times New Roman" w:hAnsi="Times New Roman"/>
-          <w:szCs w:val="24"/>
-          <w:lang w:val="nl-NL"/>
-        </w:rPr>
-        <w:tab/>
-      </w:r>
-      <w:r>
-        <w:rPr>
-          <w:rFonts w:ascii="Times New Roman" w:hAnsi="Times New Roman"/>
-          <w:szCs w:val="24"/>
-          <w:lang w:val="nl-NL"/>
-        </w:rPr>
-        <w:tab/>
-      </w:r>
-      <w:r>
-        <w:rPr>
-          <w:rFonts w:ascii="Times New Roman" w:hAnsi="Times New Roman"/>
-          <w:szCs w:val="24"/>
-          <w:lang w:val="nl-NL"/>
-        </w:rPr>
-        <w:tab/>
-      </w:r>
-      <w:r>
-        <w:rPr>
-          <w:rFonts w:ascii="Times New Roman" w:hAnsi="Times New Roman"/>
-          <w:szCs w:val="24"/>
-          <w:lang w:val="nl-NL"/>
-        </w:rPr>
-        <w:tab/>
-      </w:r>
-      <w:r>
-        <w:rPr>
-          <w:rFonts w:ascii="Times New Roman" w:hAnsi="Times New Roman"/>
-          <w:szCs w:val="24"/>
-          <w:lang w:val="nl-NL"/>
-        </w:rPr>
-        <w:tab/>
-      </w:r>
-      <w:r>
-        <w:rPr>
-          <w:rFonts w:ascii="Times New Roman" w:hAnsi="Times New Roman"/>
-          <w:szCs w:val="24"/>
-          <w:lang w:val="nl-NL"/>
-        </w:rPr>
-        <w:tab/>
-      </w:r>
-      <w:r>
-        <w:rPr>
-          <w:rFonts w:ascii="Times New Roman" w:hAnsi="Times New Roman"/>
-          <w:szCs w:val="24"/>
-          <w:lang w:val="nl-NL"/>
-        </w:rPr>
-        <w:tab/>
-      </w:r>
-      <w:r>
-        <w:rPr>
-          <w:rFonts w:ascii="Times New Roman" w:hAnsi="Times New Roman"/>
-          <w:szCs w:val="24"/>
-          <w:lang w:val="nl-NL"/>
-        </w:rPr>
-        <w:tab/>
-      </w:r>
-      <w:r>
-        <w:rPr>
-          <w:rFonts w:ascii="Times New Roman" w:hAnsi="Times New Roman"/>
-          <w:szCs w:val="24"/>
-          <w:lang w:val="nl-NL"/>
-        </w:rPr>
-        <w:tab/>
+        <w:pStyle w:val="ListParagraph"/>
+        <w:numPr>
+          <w:ilvl w:val="0"/>
+          <w:numId w:val="8"/>
+        </w:numPr>
+        <w:snapToGrid w:val="0"/>
+        <w:spacing w:after="0" w:line="264" w:lineRule="auto"/>
+        <w:ind w:left="567" w:hanging="283"/>
+        <w:contextualSpacing w:val="0"/>
+        <w:rPr>
+          <w:rFonts w:ascii="Times New Roman" w:hAnsi="Times New Roman"/>
+          <w:bCs/>
+          <w:szCs w:val="24"/>
+          <w:lang w:val="nl-NL"/>
+        </w:rPr>
+      </w:pPr>
+      <w:r>
+        <w:rPr>
+          <w:rFonts w:ascii="Times New Roman" w:hAnsi="Times New Roman"/>
+          <w:bCs/>
+          <w:szCs w:val="24"/>
+          <w:lang w:val="nl-NL"/>
+        </w:rPr>
+        <w:t>Giải quyết khiếu nại, tranh chấp lao động, tố tụng (nếu có);</w:t>
       </w:r>
     </w:p>
     <w:p>
       <w:pPr>
-        <w:ind w:firstLine="0"/>
-        <w:rPr>
-          <w:rFonts w:ascii="Times New Roman" w:hAnsi="Times New Roman"/>
-          <w:b/>
-          <w:szCs w:val="24"/>
-          <w:lang w:val="nl-NL"/>
-        </w:rPr>
-      </w:pPr>
-      <w:r>
-        <w:rPr>
-          <w:rFonts w:ascii="Times New Roman" w:hAnsi="Times New Roman"/>
-          <w:b/>
-          <w:szCs w:val="24"/>
-          <w:u w:val="single"/>
-          <w:lang w:val="nl-NL"/>
-        </w:rPr>
-        <w:t>ĐIỀU 7:</w:t>
-      </w:r>
-      <w:r>
-        <w:rPr>
-          <w:rFonts w:ascii="Times New Roman" w:hAnsi="Times New Roman"/>
-          <w:b/>
-          <w:szCs w:val="24"/>
-          <w:lang w:val="nl-NL"/>
-        </w:rPr>
-        <w:t xml:space="preserve"> ĐIỀU KHOẢN THI HÀNH </w:t>
-      </w:r>
-      <w:r>
-        <w:rPr>
-          <w:rFonts w:ascii="Times New Roman" w:hAnsi="Times New Roman"/>
-          <w:b/>
-          <w:szCs w:val="24"/>
-          <w:lang w:val="nl-NL"/>
-        </w:rPr>
-        <w:tab/>
-      </w:r>
-      <w:r>
-        <w:rPr>
-          <w:rFonts w:ascii="Times New Roman" w:hAnsi="Times New Roman"/>
-          <w:b/>
-          <w:szCs w:val="24"/>
-          <w:lang w:val="nl-NL"/>
-        </w:rPr>
-        <w:tab/>
-      </w:r>
-      <w:r>
-        <w:rPr>
-          <w:rFonts w:ascii="Times New Roman" w:hAnsi="Times New Roman"/>
-          <w:b/>
-          <w:szCs w:val="24"/>
-          <w:lang w:val="nl-NL"/>
-        </w:rPr>
-        <w:tab/>
-      </w:r>
-      <w:r>
-        <w:rPr>
-          <w:rFonts w:ascii="Times New Roman" w:hAnsi="Times New Roman"/>
-          <w:b/>
-          <w:szCs w:val="24"/>
-          <w:lang w:val="nl-NL"/>
-        </w:rPr>
-        <w:tab/>
-      </w:r>
-      <w:r>
-        <w:rPr>
-          <w:rFonts w:ascii="Times New Roman" w:hAnsi="Times New Roman"/>
-          <w:b/>
-          <w:szCs w:val="24"/>
-          <w:lang w:val="nl-NL"/>
-        </w:rPr>
-        <w:tab/>
-      </w:r>
-      <w:r>
-        <w:rPr>
-          <w:rFonts w:ascii="Times New Roman" w:hAnsi="Times New Roman"/>
-          <w:b/>
-          <w:szCs w:val="24"/>
-          <w:lang w:val="nl-NL"/>
-        </w:rPr>
-        <w:tab/>
+        <w:pStyle w:val="ListParagraph"/>
+        <w:numPr>
+          <w:ilvl w:val="0"/>
+          <w:numId w:val="8"/>
+        </w:numPr>
+        <w:snapToGrid w:val="0"/>
+        <w:spacing w:after="0" w:line="264" w:lineRule="auto"/>
+        <w:ind w:left="567" w:hanging="283"/>
+        <w:contextualSpacing w:val="0"/>
+        <w:rPr>
+          <w:rFonts w:ascii="Times New Roman" w:hAnsi="Times New Roman"/>
+          <w:bCs/>
+          <w:szCs w:val="24"/>
+          <w:lang w:val="nl-NL"/>
+        </w:rPr>
+      </w:pPr>
+      <w:r>
+        <w:rPr>
+          <w:rFonts w:ascii="Times New Roman" w:hAnsi="Times New Roman"/>
+          <w:bCs/>
+          <w:szCs w:val="24"/>
+          <w:lang w:val="nl-NL"/>
+        </w:rPr>
+        <w:t>Cung cấp dữ liệu cá nhân cần thiết cho khách hàng, đối tác của Công ty để phục vụ đánh giá tuân thủ, kiểm toán, trách nhiệm xã hội (CSR) hoặc các yêu cầu hợp pháp liên quan đến quan hệ lao động;</w:t>
       </w:r>
     </w:p>
     <w:p>
       <w:pPr>
-        <w:ind w:left="360" w:firstLine="0"/>
-        <w:rPr>
-          <w:rFonts w:ascii="Times New Roman" w:hAnsi="Times New Roman"/>
-          <w:szCs w:val="24"/>
-          <w:lang w:val="nl-NL"/>
-        </w:rPr>
-      </w:pPr>
-      <w:r>
-        <w:rPr>
-          <w:rFonts w:ascii="Times New Roman" w:hAnsi="Times New Roman"/>
-          <w:szCs w:val="24"/>
-          <w:lang w:val="nl-NL"/>
-        </w:rPr>
-        <w:t>- Những vấn đề về lao động không ghi trong hợp đồng này thì áp dụng theo quy định của Nội quy công ty, Thoả ước lao động tập thể hoặc quy định của pháp luật có liên quan.</w:t>
+        <w:pStyle w:val="ListParagraph"/>
+        <w:numPr>
+          <w:ilvl w:val="0"/>
+          <w:numId w:val="8"/>
+        </w:numPr>
+        <w:snapToGrid w:val="0"/>
+        <w:spacing w:after="0" w:line="264" w:lineRule="auto"/>
+        <w:ind w:left="567" w:hanging="283"/>
+        <w:contextualSpacing w:val="0"/>
+        <w:rPr>
+          <w:rFonts w:ascii="Times New Roman" w:hAnsi="Times New Roman"/>
+          <w:bCs/>
+          <w:szCs w:val="24"/>
+          <w:lang w:val="nl-NL"/>
+        </w:rPr>
+      </w:pPr>
+      <w:r>
+        <w:rPr>
+          <w:rFonts w:ascii="Times New Roman" w:hAnsi="Times New Roman"/>
+          <w:bCs/>
+          <w:szCs w:val="24"/>
+          <w:lang w:val="nl-NL"/>
+        </w:rPr>
+        <w:t>Cung cấp cho cơ quan nhà nước có thẩm quyền khi có yêu cầu hợp pháp.</w:t>
       </w:r>
     </w:p>
     <w:p>
       <w:pPr>
-        <w:ind w:left="360" w:firstLine="0"/>
-        <w:rPr>
-          <w:rFonts w:ascii="Times New Roman" w:hAnsi="Times New Roman"/>
-          <w:szCs w:val="24"/>
-          <w:lang w:val="nl-NL"/>
-        </w:rPr>
-      </w:pPr>
-      <w:r>
-        <w:rPr>
-          <w:rFonts w:ascii="Times New Roman" w:hAnsi="Times New Roman"/>
-          <w:szCs w:val="24"/>
-          <w:lang w:val="nl-NL"/>
-        </w:rPr>
-        <w:t>- Hợp đồng lao động này được làm thành hai (02) bản có giá trị ngang nhau, mỗi bên giữ một  (01) bản và có hiệu lực kể từ ngày ký.</w:t>
+        <w:pStyle w:val="ListParagraph"/>
+        <w:numPr>
+          <w:ilvl w:val="1"/>
+          <w:numId w:val="11"/>
+        </w:numPr>
+        <w:snapToGrid w:val="0"/>
+        <w:spacing w:after="0" w:line="264" w:lineRule="auto"/>
+        <w:ind w:left="426" w:hanging="426"/>
+        <w:contextualSpacing w:val="0"/>
+        <w:rPr>
+          <w:rFonts w:ascii="Times New Roman" w:hAnsi="Times New Roman"/>
+          <w:bCs/>
+          <w:szCs w:val="24"/>
+          <w:lang w:val="nl-NL"/>
+        </w:rPr>
+      </w:pPr>
+      <w:r>
+        <w:rPr>
+          <w:rFonts w:ascii="Times New Roman" w:hAnsi="Times New Roman"/>
+          <w:bCs/>
+          <w:szCs w:val="24"/>
+          <w:lang w:val="nl-NL"/>
+        </w:rPr>
+        <w:t>Thời hạn lưu trữ dữ liệu cá nhân được thực hiện theo quy định của pháp luật hoặc theo thời hiệu gắn với mục đích xử lý dữ liệu nêu tại Khoản 6.2 Điều này.</w:t>
       </w:r>
     </w:p>
     <w:p>
       <w:pPr>
-        <w:ind w:left="360" w:firstLine="0"/>
-        <w:rPr>
-          <w:lang w:val="nl-NL"/>
-        </w:rPr>
-      </w:pPr>
-      <w:r>
-        <w:rPr>
-          <w:rFonts w:ascii="Times New Roman" w:hAnsi="Times New Roman"/>
-          <w:szCs w:val="24"/>
-          <w:lang w:val="nl-NL"/>
-        </w:rPr>
-        <w:t xml:space="preserve">- Trong trường hợp có bất kỳ sửa đổi, bổ sung thì hai bên sẽ ký kết phụ lục hợp đồng. Khi hai bên ký kết Phụ lục hợp </w:t>
-      </w:r>
-      <w:r>
-        <w:rPr>
-          <w:rFonts w:ascii="Times New Roman" w:hAnsi="Times New Roman" w:hint="eastAsia"/>
-          <w:szCs w:val="24"/>
-          <w:lang w:val="nl-NL"/>
-        </w:rPr>
-        <w:t>đ</w:t>
-      </w:r>
-      <w:r>
-        <w:rPr>
-          <w:rFonts w:ascii="Times New Roman" w:hAnsi="Times New Roman"/>
-          <w:szCs w:val="24"/>
-          <w:lang w:val="nl-NL"/>
-        </w:rPr>
-        <w:t xml:space="preserve">ồng lao </w:t>
-      </w:r>
-      <w:r>
-        <w:rPr>
-          <w:rFonts w:ascii="Times New Roman" w:hAnsi="Times New Roman" w:hint="eastAsia"/>
-          <w:szCs w:val="24"/>
-          <w:lang w:val="nl-NL"/>
-        </w:rPr>
-        <w:t>đ</w:t>
-      </w:r>
-      <w:r>
-        <w:rPr>
-          <w:rFonts w:ascii="Times New Roman" w:hAnsi="Times New Roman"/>
-          <w:szCs w:val="24"/>
-          <w:lang w:val="nl-NL"/>
-        </w:rPr>
-        <w:t xml:space="preserve">ộng thì nội dung của Phụ lục hợp </w:t>
-      </w:r>
-      <w:r>
-        <w:rPr>
-          <w:rFonts w:ascii="Times New Roman" w:hAnsi="Times New Roman" w:hint="eastAsia"/>
-          <w:szCs w:val="24"/>
-          <w:lang w:val="nl-NL"/>
-        </w:rPr>
-        <w:t>đ</w:t>
-      </w:r>
-      <w:r>
-        <w:rPr>
-          <w:rFonts w:ascii="Times New Roman" w:hAnsi="Times New Roman"/>
-          <w:szCs w:val="24"/>
-          <w:lang w:val="nl-NL"/>
-        </w:rPr>
-        <w:t xml:space="preserve">ồng lao </w:t>
-      </w:r>
-      <w:r>
-        <w:rPr>
-          <w:rFonts w:ascii="Times New Roman" w:hAnsi="Times New Roman" w:hint="eastAsia"/>
-          <w:szCs w:val="24"/>
-          <w:lang w:val="nl-NL"/>
-        </w:rPr>
-        <w:t>đ</w:t>
-      </w:r>
-      <w:r>
-        <w:rPr>
-          <w:rFonts w:ascii="Times New Roman" w:hAnsi="Times New Roman"/>
-          <w:szCs w:val="24"/>
-          <w:lang w:val="nl-NL"/>
-        </w:rPr>
-        <w:t>ộng cũng có giá trị nh</w:t>
-      </w:r>
-      <w:r>
-        <w:rPr>
-          <w:rFonts w:ascii="Times New Roman" w:hAnsi="Times New Roman" w:hint="eastAsia"/>
-          <w:szCs w:val="24"/>
-          <w:lang w:val="nl-NL"/>
-        </w:rPr>
-        <w:t>ư</w:t>
-      </w:r>
-      <w:r>
-        <w:rPr>
-          <w:rFonts w:ascii="Times New Roman" w:hAnsi="Times New Roman"/>
-          <w:szCs w:val="24"/>
-          <w:lang w:val="nl-NL"/>
-        </w:rPr>
-        <w:t xml:space="preserve"> các nội dung của bản hợp </w:t>
-      </w:r>
-      <w:r>
-        <w:rPr>
-          <w:rFonts w:ascii="Times New Roman" w:hAnsi="Times New Roman" w:hint="eastAsia"/>
-          <w:szCs w:val="24"/>
-          <w:lang w:val="nl-NL"/>
-        </w:rPr>
-        <w:t>đ</w:t>
-      </w:r>
-      <w:r>
-        <w:rPr>
-          <w:rFonts w:ascii="Times New Roman" w:hAnsi="Times New Roman"/>
-          <w:szCs w:val="24"/>
-          <w:lang w:val="nl-NL"/>
-        </w:rPr>
-        <w:t>ồng này.</w:t>
-      </w:r>
-      <w:r>
-        <w:rPr>
-          <w:rFonts w:ascii="Times New Roman" w:hAnsi="Times New Roman"/>
-          <w:szCs w:val="24"/>
-          <w:lang w:val="nl-NL"/>
-        </w:rPr>
-        <w:tab/>
-      </w:r>
-      <w:r>
-        <w:rPr>
-          <w:rFonts w:ascii="Times New Roman" w:hAnsi="Times New Roman"/>
-          <w:szCs w:val="24"/>
-          <w:lang w:val="nl-NL"/>
-        </w:rPr>
-        <w:tab/>
-      </w:r>
-      <w:r>
-        <w:rPr>
-          <w:rFonts w:ascii="Times New Roman" w:hAnsi="Times New Roman"/>
-          <w:szCs w:val="24"/>
-          <w:lang w:val="nl-NL"/>
-        </w:rPr>
-        <w:tab/>
-      </w:r>
-      <w:r>
-        <w:rPr>
-          <w:rFonts w:ascii="Times New Roman" w:hAnsi="Times New Roman"/>
-          <w:szCs w:val="24"/>
-          <w:lang w:val="nl-NL"/>
-        </w:rPr>
-        <w:tab/>
-      </w:r>
-      <w:r>
-        <w:rPr>
-          <w:rFonts w:ascii="Times New Roman" w:hAnsi="Times New Roman"/>
-          <w:szCs w:val="24"/>
-          <w:lang w:val="nl-NL"/>
-        </w:rPr>
-        <w:tab/>
-      </w:r>
-      <w:r>
-        <w:rPr>
-          <w:rFonts w:ascii="Times New Roman" w:hAnsi="Times New Roman"/>
-          <w:szCs w:val="24"/>
-          <w:lang w:val="nl-NL"/>
-        </w:rPr>
-        <w:tab/>
-      </w:r>
-      <w:r>
-        <w:rPr>
-          <w:lang w:val="nl-NL"/>
-        </w:rPr>
-        <w:tab/>
-      </w:r>
-      <w:r>
-        <w:rPr>
-          <w:lang w:val="nl-NL"/>
-        </w:rPr>
-        <w:tab/>
-      </w:r>
-      <w:r>
-        <w:rPr>
-          <w:lang w:val="nl-NL"/>
-        </w:rPr>
-        <w:tab/>
-      </w:r>
-      <w:r>
-        <w:rPr>
-          <w:lang w:val="nl-NL"/>
-        </w:rPr>
-        <w:tab/>
-      </w:r>
-      <w:r>
-        <w:rPr>
-          <w:lang w:val="nl-NL"/>
-        </w:rPr>
-        <w:tab/>
-      </w:r>
-      <w:r>
-        <w:rPr>
-          <w:lang w:val="nl-NL"/>
-        </w:rPr>
-        <w:tab/>
-      </w:r>
-      <w:r>
-        <w:rPr>
-          <w:lang w:val="nl-NL"/>
-        </w:rPr>
-        <w:tab/>
-      </w:r>
-      <w:r>
-        <w:rPr>
-          <w:lang w:val="nl-NL"/>
-        </w:rPr>
-        <w:tab/>
-      </w:r>
-      <w:r>
-        <w:rPr>
-          <w:lang w:val="nl-NL"/>
-        </w:rPr>
-        <w:tab/>
-      </w:r>
-      <w:r>
-        <w:rPr>
-          <w:lang w:val="nl-NL"/>
-        </w:rPr>
-        <w:tab/>
-      </w:r>
-      <w:r>
-        <w:rPr>
-          <w:lang w:val="nl-NL"/>
-        </w:rPr>
-        <w:tab/>
-      </w:r>
-      <w:r>
-        <w:rPr>
-          <w:lang w:val="nl-NL"/>
-        </w:rPr>
-        <w:tab/>
-      </w:r>
-      <w:r>
-        <w:rPr>
-          <w:lang w:val="nl-NL"/>
-        </w:rPr>
-        <w:tab/>
-      </w:r>
-      <w:r>
-        <w:rPr>
-          <w:lang w:val="nl-NL"/>
-        </w:rPr>
-        <w:tab/>
+        <w:pStyle w:val="ListParagraph"/>
+        <w:numPr>
+          <w:ilvl w:val="1"/>
+          <w:numId w:val="11"/>
+        </w:numPr>
+        <w:snapToGrid w:val="0"/>
+        <w:spacing w:after="0" w:line="264" w:lineRule="auto"/>
+        <w:ind w:left="426" w:hanging="426"/>
+        <w:contextualSpacing w:val="0"/>
+        <w:rPr>
+          <w:rFonts w:ascii="Times New Roman" w:hAnsi="Times New Roman"/>
+          <w:bCs/>
+          <w:szCs w:val="24"/>
+          <w:lang w:val="nl-NL"/>
+        </w:rPr>
+      </w:pPr>
+      <w:r>
+        <w:rPr>
+          <w:rFonts w:ascii="Times New Roman" w:hAnsi="Times New Roman"/>
+          <w:bCs/>
+          <w:szCs w:val="24"/>
+          <w:lang w:val="nl-NL"/>
+        </w:rPr>
+        <w:t>Công ty cam kết bảo mật dữ liệu cá nhân của Người lao động, chỉ cung cấp trong phạm vi cần thiết, đúng mục đích, có căn cứ pháp luật; áp dụng các biện pháp quản lý và kỹ thuật để bảo vệ dữ liệu.</w:t>
       </w:r>
     </w:p>
     <w:p>
       <w:pPr>
-        <w:ind w:left="540" w:hanging="180"/>
-        <w:rPr>
-          <w:rFonts w:ascii="Times New Roman" w:hAnsi="Times New Roman"/>
-          <w:szCs w:val="24"/>
-          <w:lang w:val="nl-NL"/>
-        </w:rPr>
-      </w:pPr>
+        <w:snapToGrid w:val="0"/>
+        <w:spacing w:after="0" w:line="264" w:lineRule="auto"/>
+        <w:ind w:left="0" w:firstLine="0"/>
+        <w:rPr>
+          <w:rFonts w:ascii="Times New Roman" w:hAnsi="Times New Roman"/>
+          <w:b/>
+          <w:szCs w:val="24"/>
+          <w:lang w:val="nl-NL"/>
+        </w:rPr>
+      </w:pPr>
+      <w:r>
+        <w:rPr>
+          <w:rFonts w:ascii="Times New Roman" w:hAnsi="Times New Roman"/>
+          <w:b/>
+          <w:szCs w:val="24"/>
+          <w:u w:val="single"/>
+          <w:lang w:val="nl-NL"/>
+        </w:rPr>
+        <w:t>ĐIỀU 7:</w:t>
+      </w:r>
+      <w:r>
+        <w:rPr>
+          <w:rFonts w:ascii="Times New Roman" w:hAnsi="Times New Roman"/>
+          <w:b/>
+          <w:szCs w:val="24"/>
+          <w:lang w:val="nl-NL"/>
+        </w:rPr>
+        <w:t xml:space="preserve"> THỎA THUẬN KHÁC</w:t>
+      </w:r>
+    </w:p>
+    <w:p>
+      <w:pPr>
+        <w:pStyle w:val="ListParagraph"/>
+        <w:numPr>
+          <w:ilvl w:val="0"/>
+          <w:numId w:val="9"/>
+        </w:numPr>
+        <w:snapToGrid w:val="0"/>
+        <w:spacing w:after="0" w:line="264" w:lineRule="auto"/>
+        <w:ind w:left="567" w:hanging="283"/>
+        <w:contextualSpacing w:val="0"/>
+        <w:rPr>
+          <w:rFonts w:ascii="Times New Roman" w:hAnsi="Times New Roman"/>
+          <w:szCs w:val="24"/>
+          <w:lang w:val="nl-NL"/>
+        </w:rPr>
+      </w:pPr>
+      <w:r>
+        <w:rPr>
+          <w:rFonts w:ascii="Times New Roman" w:hAnsi="Times New Roman"/>
+          <w:szCs w:val="24"/>
+          <w:lang w:val="nl-NL"/>
+        </w:rPr>
+        <w:t>Công ty được quyền chấm dứt HĐLĐ trước thời hạn đối với Người lao động có kết quả đánh giá hiệu suất công việc dưới mức quy định trong 03 tháng liên tục.</w:t>
+      </w:r>
+    </w:p>
+    <w:p>
+      <w:pPr>
+        <w:pStyle w:val="ListParagraph"/>
+        <w:numPr>
+          <w:ilvl w:val="0"/>
+          <w:numId w:val="9"/>
+        </w:numPr>
+        <w:snapToGrid w:val="0"/>
+        <w:spacing w:after="0" w:line="264" w:lineRule="auto"/>
+        <w:ind w:left="567" w:hanging="283"/>
+        <w:contextualSpacing w:val="0"/>
+        <w:rPr>
+          <w:rFonts w:ascii="Times New Roman" w:hAnsi="Times New Roman"/>
+          <w:szCs w:val="24"/>
+          <w:lang w:val="nl-NL"/>
+        </w:rPr>
+      </w:pPr>
+      <w:r>
+        <w:rPr>
+          <w:rFonts w:ascii="Times New Roman" w:hAnsi="Times New Roman"/>
+          <w:szCs w:val="24"/>
+          <w:lang w:val="nl-NL"/>
+        </w:rPr>
+        <w:t>Trong quá trình thực hiện hợp đồng nếu một bên có nhu cầu thay đổi nội dung trong hợp đồng phải báo cho bên kia trước ít nhất 03 ngày và ký kết bản Phụ lục hợp đồng theo quy định của Pháp luật. Trong thời gian tiến hành thỏa thuận hai bên vẫn tuân theo hợp đồng lao động đã ký kết.</w:t>
+      </w:r>
+    </w:p>
+    <w:p>
+      <w:pPr>
+        <w:pStyle w:val="ListParagraph"/>
+        <w:numPr>
+          <w:ilvl w:val="0"/>
+          <w:numId w:val="9"/>
+        </w:numPr>
+        <w:snapToGrid w:val="0"/>
+        <w:spacing w:after="0" w:line="264" w:lineRule="auto"/>
+        <w:ind w:left="567" w:hanging="283"/>
+        <w:contextualSpacing w:val="0"/>
+        <w:rPr>
+          <w:rFonts w:ascii="Times New Roman" w:hAnsi="Times New Roman"/>
+          <w:szCs w:val="24"/>
+          <w:lang w:val="nl-NL"/>
+        </w:rPr>
+      </w:pPr>
+      <w:r>
+        <w:rPr>
+          <w:rFonts w:ascii="Times New Roman" w:hAnsi="Times New Roman"/>
+          <w:szCs w:val="24"/>
+          <w:lang w:val="nl-NL"/>
+        </w:rPr>
+        <w:t>Người lao động đọc kỹ, hiểu rõ và cam kết thực hiện các điều khoản và quy định ghi tại Hợp đồng lao động.</w:t>
+      </w:r>
       <w:r>
         <w:rPr>
           <w:rFonts w:ascii="Times New Roman" w:hAnsi="Times New Roman"/>
@@ -9374,6 +8716,238 @@
         <w:rPr>
           <w:rFonts w:ascii="Times New Roman" w:hAnsi="Times New Roman"/>
           <w:szCs w:val="24"/>
+          <w:lang w:val="nl-NL"/>
+        </w:rPr>
+        <w:tab/>
+      </w:r>
+      <w:r>
+        <w:rPr>
+          <w:rFonts w:ascii="Times New Roman" w:hAnsi="Times New Roman"/>
+          <w:szCs w:val="24"/>
+          <w:lang w:val="nl-NL"/>
+        </w:rPr>
+        <w:tab/>
+      </w:r>
+    </w:p>
+    <w:p>
+      <w:pPr>
+        <w:snapToGrid w:val="0"/>
+        <w:spacing w:after="0" w:line="264" w:lineRule="auto"/>
+        <w:ind w:left="0" w:firstLine="0"/>
+        <w:rPr>
+          <w:rFonts w:ascii="Times New Roman" w:hAnsi="Times New Roman"/>
+          <w:b/>
+          <w:szCs w:val="24"/>
+          <w:lang w:val="nl-NL"/>
+        </w:rPr>
+      </w:pPr>
+      <w:r>
+        <w:rPr>
+          <w:rFonts w:ascii="Times New Roman" w:hAnsi="Times New Roman"/>
+          <w:b/>
+          <w:szCs w:val="24"/>
+          <w:u w:val="single"/>
+          <w:lang w:val="nl-NL"/>
+        </w:rPr>
+        <w:t>ĐIỀU 8:</w:t>
+      </w:r>
+      <w:r>
+        <w:rPr>
+          <w:rFonts w:ascii="Times New Roman" w:hAnsi="Times New Roman"/>
+          <w:b/>
+          <w:szCs w:val="24"/>
+          <w:lang w:val="nl-NL"/>
+        </w:rPr>
+        <w:t xml:space="preserve"> ĐIỀU KHOẢN THI HÀNH </w:t>
+      </w:r>
+      <w:r>
+        <w:rPr>
+          <w:rFonts w:ascii="Times New Roman" w:hAnsi="Times New Roman"/>
+          <w:b/>
+          <w:szCs w:val="24"/>
+          <w:lang w:val="nl-NL"/>
+        </w:rPr>
+        <w:tab/>
+      </w:r>
+      <w:r>
+        <w:rPr>
+          <w:rFonts w:ascii="Times New Roman" w:hAnsi="Times New Roman"/>
+          <w:b/>
+          <w:szCs w:val="24"/>
+          <w:lang w:val="nl-NL"/>
+        </w:rPr>
+        <w:tab/>
+      </w:r>
+      <w:r>
+        <w:rPr>
+          <w:rFonts w:ascii="Times New Roman" w:hAnsi="Times New Roman"/>
+          <w:b/>
+          <w:szCs w:val="24"/>
+          <w:lang w:val="nl-NL"/>
+        </w:rPr>
+        <w:tab/>
+      </w:r>
+      <w:r>
+        <w:rPr>
+          <w:rFonts w:ascii="Times New Roman" w:hAnsi="Times New Roman"/>
+          <w:b/>
+          <w:szCs w:val="24"/>
+          <w:lang w:val="nl-NL"/>
+        </w:rPr>
+        <w:tab/>
+      </w:r>
+      <w:r>
+        <w:rPr>
+          <w:rFonts w:ascii="Times New Roman" w:hAnsi="Times New Roman"/>
+          <w:b/>
+          <w:szCs w:val="24"/>
+          <w:lang w:val="nl-NL"/>
+        </w:rPr>
+        <w:tab/>
+      </w:r>
+      <w:r>
+        <w:rPr>
+          <w:rFonts w:ascii="Times New Roman" w:hAnsi="Times New Roman"/>
+          <w:b/>
+          <w:szCs w:val="24"/>
+          <w:lang w:val="nl-NL"/>
+        </w:rPr>
+        <w:tab/>
+      </w:r>
+    </w:p>
+    <w:p>
+      <w:pPr>
+        <w:pStyle w:val="ListParagraph"/>
+        <w:numPr>
+          <w:ilvl w:val="0"/>
+          <w:numId w:val="10"/>
+        </w:numPr>
+        <w:snapToGrid w:val="0"/>
+        <w:spacing w:after="0" w:line="264" w:lineRule="auto"/>
+        <w:ind w:left="567" w:hanging="283"/>
+        <w:contextualSpacing w:val="0"/>
+        <w:rPr>
+          <w:rFonts w:ascii="Times New Roman" w:hAnsi="Times New Roman"/>
+          <w:szCs w:val="24"/>
+          <w:lang w:val="nl-NL"/>
+        </w:rPr>
+      </w:pPr>
+      <w:r>
+        <w:rPr>
+          <w:rFonts w:ascii="Times New Roman" w:hAnsi="Times New Roman"/>
+          <w:szCs w:val="24"/>
+          <w:lang w:val="nl-NL"/>
+        </w:rPr>
+        <w:t>Những vấn đề về lao động không ghi trong hợp đồng này thì áp dụng theo quy định của Nội quy công ty, Thoả ước lao động tập thể hoặc quy định của pháp luật có liên quan.</w:t>
+      </w:r>
+    </w:p>
+    <w:p>
+      <w:pPr>
+        <w:pStyle w:val="ListParagraph"/>
+        <w:numPr>
+          <w:ilvl w:val="0"/>
+          <w:numId w:val="10"/>
+        </w:numPr>
+        <w:snapToGrid w:val="0"/>
+        <w:spacing w:after="0" w:line="264" w:lineRule="auto"/>
+        <w:ind w:left="567" w:hanging="283"/>
+        <w:contextualSpacing w:val="0"/>
+        <w:rPr>
+          <w:rFonts w:ascii="Times New Roman" w:hAnsi="Times New Roman"/>
+          <w:szCs w:val="24"/>
+          <w:lang w:val="nl-NL"/>
+        </w:rPr>
+      </w:pPr>
+      <w:r>
+        <w:rPr>
+          <w:rFonts w:ascii="Times New Roman" w:hAnsi="Times New Roman"/>
+          <w:szCs w:val="24"/>
+          <w:lang w:val="nl-NL"/>
+        </w:rPr>
+        <w:t xml:space="preserve">Hợp đồng lao động này được làm thành hai (02) bản có giá trị </w:t>
+      </w:r>
+      <w:r>
+        <w:rPr>
+          <w:rFonts w:ascii="Times New Roman" w:hAnsi="Times New Roman"/>
+          <w:szCs w:val="24"/>
+          <w:lang w:val="nl-NL"/>
+        </w:rPr>
+        <w:t>như</w:t>
+      </w:r>
+      <w:r>
+        <w:rPr>
+          <w:rFonts w:ascii="Times New Roman" w:hAnsi="Times New Roman"/>
+          <w:szCs w:val="24"/>
+          <w:lang w:val="nl-NL"/>
+        </w:rPr>
+        <w:t xml:space="preserve"> nhau, mỗi bên giữ một (01) bản và có hiệu lực kể từ ngày ký.</w:t>
+      </w:r>
+    </w:p>
+    <w:p>
+      <w:pPr>
+        <w:ind w:left="360" w:firstLine="0"/>
+        <w:rPr>
+          <w:lang w:val="nl-NL"/>
+        </w:rPr>
+      </w:pPr>
+      <w:r>
+        <w:rPr>
+          <w:rFonts w:ascii="Times New Roman" w:hAnsi="Times New Roman"/>
+          <w:szCs w:val="24"/>
+          <w:lang w:val="nl-NL"/>
+        </w:rPr>
+        <w:t>Trong trường hợp có bất kỳ sửa đổi, bổ sung thì hai bên sẽ ký kết phụ lục hợp đồng. Khi hai bên ký kết Phụ lục hợp đồng lao động thì nội dung của Phụ lục hợp đồng lao động cũng có giá trị như các nội dung của bản hợp đồng này.</w:t>
+      </w:r>
+      <w:r>
+        <w:rPr>
+          <w:rFonts w:ascii="Times New Roman" w:hAnsi="Times New Roman"/>
+          <w:szCs w:val="24"/>
+          <w:lang w:val="nl-NL"/>
+        </w:rPr>
+        <w:tab/>
+      </w:r>
+      <w:r>
+        <w:rPr>
+          <w:rFonts w:ascii="Times New Roman" w:hAnsi="Times New Roman"/>
+          <w:szCs w:val="24"/>
+          <w:lang w:val="nl-NL"/>
+        </w:rPr>
+        <w:tab/>
+      </w:r>
+      <w:r>
+        <w:rPr>
+          <w:rFonts w:ascii="Times New Roman" w:hAnsi="Times New Roman"/>
+          <w:szCs w:val="24"/>
+          <w:lang w:val="nl-NL"/>
+        </w:rPr>
+        <w:tab/>
+      </w:r>
+      <w:r>
+        <w:rPr>
+          <w:rFonts w:ascii="Times New Roman" w:hAnsi="Times New Roman"/>
+          <w:szCs w:val="24"/>
+          <w:lang w:val="nl-NL"/>
+        </w:rPr>
+        <w:tab/>
+      </w:r>
+      <w:r>
+        <w:rPr>
+          <w:rFonts w:ascii="Times New Roman" w:hAnsi="Times New Roman"/>
+          <w:szCs w:val="24"/>
+          <w:lang w:val="nl-NL"/>
+        </w:rPr>
+        <w:tab/>
+      </w:r>
+      <w:r>
+        <w:rPr>
+          <w:rFonts w:ascii="Times New Roman" w:hAnsi="Times New Roman"/>
+          <w:szCs w:val="24"/>
+          <w:lang w:val="nl-NL"/>
+        </w:rPr>
+        <w:tab/>
+      </w:r>
+      <w:r>
+        <w:rPr>
           <w:lang w:val="nl-NL"/>
         </w:rPr>
         <w:tab/>
@@ -9791,7 +9365,7 @@
           <w:footerReference w:type="even" r:id="rId8"/>
           <w:footerReference w:type="default" r:id="rId9"/>
           <w:pgSz w:w="11909" w:h="16834" w:code="9"/>
-          <w:pgMar w:top="630" w:right="1289" w:bottom="810" w:left="1134" w:header="720" w:footer="40" w:gutter="0"/>
+          <w:pgMar w:top="720" w:right="720" w:bottom="720" w:left="720" w:header="720" w:footer="40" w:gutter="0"/>
           <w:pgNumType w:start="1"/>
           <w:cols w:space="720"/>
           <w:docGrid w:linePitch="360"/>
@@ -10318,7 +9892,121 @@
       </w:rPr>
     </w:lvl>
   </w:abstractNum>
-  <w:abstractNum w:abstractNumId="3" w15:restartNumberingAfterBreak="1">
+  <w:abstractNum w:abstractNumId="3" w15:restartNumberingAfterBreak="0">
+    <w:nsid w:val="35C8665B"/>
+    <w:multiLevelType w:val="hybridMultilevel"/>
+    <w:tmpl w:val="DCA42138"/>
+    <w:lvl w:ilvl="0" w:tplc="3A3C8CB0">
+      <w:start w:val="2"/>
+      <w:numFmt w:val="bullet"/>
+      <w:lvlText w:val="-"/>
+      <w:lvlJc w:val="left"/>
+      <w:pPr>
+        <w:ind w:left="720" w:hanging="360"/>
+      </w:pPr>
+      <w:rPr>
+        <w:rFonts w:ascii="Times New Roman" w:eastAsia="Times New Roman" w:hAnsi="Times New Roman" w:cs="Times New Roman" w:hint="default"/>
+        <w:b/>
+      </w:rPr>
+    </w:lvl>
+    <w:lvl w:ilvl="1" w:tplc="04090003" w:tentative="1">
+      <w:start w:val="1"/>
+      <w:numFmt w:val="bullet"/>
+      <w:lvlText w:val="o"/>
+      <w:lvlJc w:val="left"/>
+      <w:pPr>
+        <w:ind w:left="1440" w:hanging="360"/>
+      </w:pPr>
+      <w:rPr>
+        <w:rFonts w:ascii="Courier New" w:hAnsi="Courier New" w:cs="Courier New" w:hint="default"/>
+      </w:rPr>
+    </w:lvl>
+    <w:lvl w:ilvl="2" w:tplc="04090005" w:tentative="1">
+      <w:start w:val="1"/>
+      <w:numFmt w:val="bullet"/>
+      <w:lvlText w:val=""/>
+      <w:lvlJc w:val="left"/>
+      <w:pPr>
+        <w:ind w:left="2160" w:hanging="360"/>
+      </w:pPr>
+      <w:rPr>
+        <w:rFonts w:ascii="Wingdings" w:hAnsi="Wingdings" w:hint="default"/>
+      </w:rPr>
+    </w:lvl>
+    <w:lvl w:ilvl="3" w:tplc="04090001" w:tentative="1">
+      <w:start w:val="1"/>
+      <w:numFmt w:val="bullet"/>
+      <w:lvlText w:val=""/>
+      <w:lvlJc w:val="left"/>
+      <w:pPr>
+        <w:ind w:left="2880" w:hanging="360"/>
+      </w:pPr>
+      <w:rPr>
+        <w:rFonts w:ascii="Symbol" w:hAnsi="Symbol" w:hint="default"/>
+      </w:rPr>
+    </w:lvl>
+    <w:lvl w:ilvl="4" w:tplc="04090003" w:tentative="1">
+      <w:start w:val="1"/>
+      <w:numFmt w:val="bullet"/>
+      <w:lvlText w:val="o"/>
+      <w:lvlJc w:val="left"/>
+      <w:pPr>
+        <w:ind w:left="3600" w:hanging="360"/>
+      </w:pPr>
+      <w:rPr>
+        <w:rFonts w:ascii="Courier New" w:hAnsi="Courier New" w:cs="Courier New" w:hint="default"/>
+      </w:rPr>
+    </w:lvl>
+    <w:lvl w:ilvl="5" w:tplc="04090005" w:tentative="1">
+      <w:start w:val="1"/>
+      <w:numFmt w:val="bullet"/>
+      <w:lvlText w:val=""/>
+      <w:lvlJc w:val="left"/>
+      <w:pPr>
+        <w:ind w:left="4320" w:hanging="360"/>
+      </w:pPr>
+      <w:rPr>
+        <w:rFonts w:ascii="Wingdings" w:hAnsi="Wingdings" w:hint="default"/>
+      </w:rPr>
+    </w:lvl>
+    <w:lvl w:ilvl="6" w:tplc="04090001" w:tentative="1">
+      <w:start w:val="1"/>
+      <w:numFmt w:val="bullet"/>
+      <w:lvlText w:val=""/>
+      <w:lvlJc w:val="left"/>
+      <w:pPr>
+        <w:ind w:left="5040" w:hanging="360"/>
+      </w:pPr>
+      <w:rPr>
+        <w:rFonts w:ascii="Symbol" w:hAnsi="Symbol" w:hint="default"/>
+      </w:rPr>
+    </w:lvl>
+    <w:lvl w:ilvl="7" w:tplc="04090003" w:tentative="1">
+      <w:start w:val="1"/>
+      <w:numFmt w:val="bullet"/>
+      <w:lvlText w:val="o"/>
+      <w:lvlJc w:val="left"/>
+      <w:pPr>
+        <w:ind w:left="5760" w:hanging="360"/>
+      </w:pPr>
+      <w:rPr>
+        <w:rFonts w:ascii="Courier New" w:hAnsi="Courier New" w:cs="Courier New" w:hint="default"/>
+      </w:rPr>
+    </w:lvl>
+    <w:lvl w:ilvl="8" w:tplc="04090005" w:tentative="1">
+      <w:start w:val="1"/>
+      <w:numFmt w:val="bullet"/>
+      <w:lvlText w:val=""/>
+      <w:lvlJc w:val="left"/>
+      <w:pPr>
+        <w:ind w:left="6480" w:hanging="360"/>
+      </w:pPr>
+      <w:rPr>
+        <w:rFonts w:ascii="Wingdings" w:hAnsi="Wingdings" w:hint="default"/>
+      </w:rPr>
+    </w:lvl>
+  </w:abstractNum>
+  <w:abstractNum w:abstractNumId="4" w15:restartNumberingAfterBreak="1">
     <w:nsid w:val="44DE2EE8"/>
     <w:multiLevelType w:val="multilevel"/>
     <w:tmpl w:val="8B7A3476"/>
@@ -10431,7 +10119,121 @@
       </w:rPr>
     </w:lvl>
   </w:abstractNum>
-  <w:abstractNum w:abstractNumId="4" w15:restartNumberingAfterBreak="1">
+  <w:abstractNum w:abstractNumId="5" w15:restartNumberingAfterBreak="0">
+    <w:nsid w:val="4C0C35FB"/>
+    <w:multiLevelType w:val="hybridMultilevel"/>
+    <w:tmpl w:val="181E8284"/>
+    <w:lvl w:ilvl="0" w:tplc="3A3C8CB0">
+      <w:start w:val="2"/>
+      <w:numFmt w:val="bullet"/>
+      <w:lvlText w:val="-"/>
+      <w:lvlJc w:val="left"/>
+      <w:pPr>
+        <w:ind w:left="720" w:hanging="360"/>
+      </w:pPr>
+      <w:rPr>
+        <w:rFonts w:ascii="Times New Roman" w:eastAsia="Times New Roman" w:hAnsi="Times New Roman" w:cs="Times New Roman" w:hint="default"/>
+        <w:b/>
+      </w:rPr>
+    </w:lvl>
+    <w:lvl w:ilvl="1" w:tplc="04090003" w:tentative="1">
+      <w:start w:val="1"/>
+      <w:numFmt w:val="bullet"/>
+      <w:lvlText w:val="o"/>
+      <w:lvlJc w:val="left"/>
+      <w:pPr>
+        <w:ind w:left="1440" w:hanging="360"/>
+      </w:pPr>
+      <w:rPr>
+        <w:rFonts w:ascii="Courier New" w:hAnsi="Courier New" w:cs="Courier New" w:hint="default"/>
+      </w:rPr>
+    </w:lvl>
+    <w:lvl w:ilvl="2" w:tplc="04090005" w:tentative="1">
+      <w:start w:val="1"/>
+      <w:numFmt w:val="bullet"/>
+      <w:lvlText w:val=""/>
+      <w:lvlJc w:val="left"/>
+      <w:pPr>
+        <w:ind w:left="2160" w:hanging="360"/>
+      </w:pPr>
+      <w:rPr>
+        <w:rFonts w:ascii="Wingdings" w:hAnsi="Wingdings" w:hint="default"/>
+      </w:rPr>
+    </w:lvl>
+    <w:lvl w:ilvl="3" w:tplc="04090001" w:tentative="1">
+      <w:start w:val="1"/>
+      <w:numFmt w:val="bullet"/>
+      <w:lvlText w:val=""/>
+      <w:lvlJc w:val="left"/>
+      <w:pPr>
+        <w:ind w:left="2880" w:hanging="360"/>
+      </w:pPr>
+      <w:rPr>
+        <w:rFonts w:ascii="Symbol" w:hAnsi="Symbol" w:hint="default"/>
+      </w:rPr>
+    </w:lvl>
+    <w:lvl w:ilvl="4" w:tplc="04090003" w:tentative="1">
+      <w:start w:val="1"/>
+      <w:numFmt w:val="bullet"/>
+      <w:lvlText w:val="o"/>
+      <w:lvlJc w:val="left"/>
+      <w:pPr>
+        <w:ind w:left="3600" w:hanging="360"/>
+      </w:pPr>
+      <w:rPr>
+        <w:rFonts w:ascii="Courier New" w:hAnsi="Courier New" w:cs="Courier New" w:hint="default"/>
+      </w:rPr>
+    </w:lvl>
+    <w:lvl w:ilvl="5" w:tplc="04090005" w:tentative="1">
+      <w:start w:val="1"/>
+      <w:numFmt w:val="bullet"/>
+      <w:lvlText w:val=""/>
+      <w:lvlJc w:val="left"/>
+      <w:pPr>
+        <w:ind w:left="4320" w:hanging="360"/>
+      </w:pPr>
+      <w:rPr>
+        <w:rFonts w:ascii="Wingdings" w:hAnsi="Wingdings" w:hint="default"/>
+      </w:rPr>
+    </w:lvl>
+    <w:lvl w:ilvl="6" w:tplc="04090001" w:tentative="1">
+      <w:start w:val="1"/>
+      <w:numFmt w:val="bullet"/>
+      <w:lvlText w:val=""/>
+      <w:lvlJc w:val="left"/>
+      <w:pPr>
+        <w:ind w:left="5040" w:hanging="360"/>
+      </w:pPr>
+      <w:rPr>
+        <w:rFonts w:ascii="Symbol" w:hAnsi="Symbol" w:hint="default"/>
+      </w:rPr>
+    </w:lvl>
+    <w:lvl w:ilvl="7" w:tplc="04090003" w:tentative="1">
+      <w:start w:val="1"/>
+      <w:numFmt w:val="bullet"/>
+      <w:lvlText w:val="o"/>
+      <w:lvlJc w:val="left"/>
+      <w:pPr>
+        <w:ind w:left="5760" w:hanging="360"/>
+      </w:pPr>
+      <w:rPr>
+        <w:rFonts w:ascii="Courier New" w:hAnsi="Courier New" w:cs="Courier New" w:hint="default"/>
+      </w:rPr>
+    </w:lvl>
+    <w:lvl w:ilvl="8" w:tplc="04090005" w:tentative="1">
+      <w:start w:val="1"/>
+      <w:numFmt w:val="bullet"/>
+      <w:lvlText w:val=""/>
+      <w:lvlJc w:val="left"/>
+      <w:pPr>
+        <w:ind w:left="6480" w:hanging="360"/>
+      </w:pPr>
+      <w:rPr>
+        <w:rFonts w:ascii="Wingdings" w:hAnsi="Wingdings" w:hint="default"/>
+      </w:rPr>
+    </w:lvl>
+  </w:abstractNum>
+  <w:abstractNum w:abstractNumId="6" w15:restartNumberingAfterBreak="1">
     <w:nsid w:val="50FF13D5"/>
     <w:multiLevelType w:val="multilevel"/>
     <w:tmpl w:val="EE96A868"/>
@@ -10544,7 +10346,7 @@
       </w:rPr>
     </w:lvl>
   </w:abstractNum>
-  <w:abstractNum w:abstractNumId="5" w15:restartNumberingAfterBreak="1">
+  <w:abstractNum w:abstractNumId="7" w15:restartNumberingAfterBreak="1">
     <w:nsid w:val="554F0DD8"/>
     <w:multiLevelType w:val="hybridMultilevel"/>
     <w:tmpl w:val="2AA21118"/>
@@ -10657,7 +10459,234 @@
       </w:rPr>
     </w:lvl>
   </w:abstractNum>
-  <w:abstractNum w:abstractNumId="6" w15:restartNumberingAfterBreak="1">
+  <w:abstractNum w:abstractNumId="8" w15:restartNumberingAfterBreak="0">
+    <w:nsid w:val="5DD7389A"/>
+    <w:multiLevelType w:val="multilevel"/>
+    <w:tmpl w:val="52E216FC"/>
+    <w:lvl w:ilvl="0">
+      <w:start w:val="6"/>
+      <w:numFmt w:val="decimal"/>
+      <w:lvlText w:val="%1."/>
+      <w:lvlJc w:val="left"/>
+      <w:pPr>
+        <w:ind w:left="360" w:hanging="360"/>
+      </w:pPr>
+      <w:rPr>
+        <w:rFonts w:hint="default"/>
+      </w:rPr>
+    </w:lvl>
+    <w:lvl w:ilvl="1">
+      <w:start w:val="1"/>
+      <w:numFmt w:val="decimal"/>
+      <w:lvlText w:val="%1.%2."/>
+      <w:lvlJc w:val="left"/>
+      <w:pPr>
+        <w:ind w:left="720" w:hanging="360"/>
+      </w:pPr>
+      <w:rPr>
+        <w:rFonts w:hint="default"/>
+      </w:rPr>
+    </w:lvl>
+    <w:lvl w:ilvl="2">
+      <w:start w:val="1"/>
+      <w:numFmt w:val="decimal"/>
+      <w:lvlText w:val="%1.%2.%3."/>
+      <w:lvlJc w:val="left"/>
+      <w:pPr>
+        <w:ind w:left="1440" w:hanging="720"/>
+      </w:pPr>
+      <w:rPr>
+        <w:rFonts w:hint="default"/>
+      </w:rPr>
+    </w:lvl>
+    <w:lvl w:ilvl="3">
+      <w:start w:val="1"/>
+      <w:numFmt w:val="decimal"/>
+      <w:lvlText w:val="%1.%2.%3.%4."/>
+      <w:lvlJc w:val="left"/>
+      <w:pPr>
+        <w:ind w:left="1800" w:hanging="720"/>
+      </w:pPr>
+      <w:rPr>
+        <w:rFonts w:hint="default"/>
+      </w:rPr>
+    </w:lvl>
+    <w:lvl w:ilvl="4">
+      <w:start w:val="1"/>
+      <w:numFmt w:val="decimal"/>
+      <w:lvlText w:val="%1.%2.%3.%4.%5."/>
+      <w:lvlJc w:val="left"/>
+      <w:pPr>
+        <w:ind w:left="2520" w:hanging="1080"/>
+      </w:pPr>
+      <w:rPr>
+        <w:rFonts w:hint="default"/>
+      </w:rPr>
+    </w:lvl>
+    <w:lvl w:ilvl="5">
+      <w:start w:val="1"/>
+      <w:numFmt w:val="decimal"/>
+      <w:lvlText w:val="%1.%2.%3.%4.%5.%6."/>
+      <w:lvlJc w:val="left"/>
+      <w:pPr>
+        <w:ind w:left="2880" w:hanging="1080"/>
+      </w:pPr>
+      <w:rPr>
+        <w:rFonts w:hint="default"/>
+      </w:rPr>
+    </w:lvl>
+    <w:lvl w:ilvl="6">
+      <w:start w:val="1"/>
+      <w:numFmt w:val="decimal"/>
+      <w:lvlText w:val="%1.%2.%3.%4.%5.%6.%7."/>
+      <w:lvlJc w:val="left"/>
+      <w:pPr>
+        <w:ind w:left="3600" w:hanging="1440"/>
+      </w:pPr>
+      <w:rPr>
+        <w:rFonts w:hint="default"/>
+      </w:rPr>
+    </w:lvl>
+    <w:lvl w:ilvl="7">
+      <w:start w:val="1"/>
+      <w:numFmt w:val="decimal"/>
+      <w:lvlText w:val="%1.%2.%3.%4.%5.%6.%7.%8."/>
+      <w:lvlJc w:val="left"/>
+      <w:pPr>
+        <w:ind w:left="3960" w:hanging="1440"/>
+      </w:pPr>
+      <w:rPr>
+        <w:rFonts w:hint="default"/>
+      </w:rPr>
+    </w:lvl>
+    <w:lvl w:ilvl="8">
+      <w:start w:val="1"/>
+      <w:numFmt w:val="decimal"/>
+      <w:lvlText w:val="%1.%2.%3.%4.%5.%6.%7.%8.%9."/>
+      <w:lvlJc w:val="left"/>
+      <w:pPr>
+        <w:ind w:left="4680" w:hanging="1800"/>
+      </w:pPr>
+      <w:rPr>
+        <w:rFonts w:hint="default"/>
+      </w:rPr>
+    </w:lvl>
+  </w:abstractNum>
+  <w:abstractNum w:abstractNumId="9" w15:restartNumberingAfterBreak="0">
+    <w:nsid w:val="68251811"/>
+    <w:multiLevelType w:val="hybridMultilevel"/>
+    <w:tmpl w:val="032C059A"/>
+    <w:lvl w:ilvl="0" w:tplc="3A3C8CB0">
+      <w:start w:val="2"/>
+      <w:numFmt w:val="bullet"/>
+      <w:lvlText w:val="-"/>
+      <w:lvlJc w:val="left"/>
+      <w:pPr>
+        <w:ind w:left="1080" w:hanging="360"/>
+      </w:pPr>
+      <w:rPr>
+        <w:rFonts w:ascii="Times New Roman" w:eastAsia="Times New Roman" w:hAnsi="Times New Roman" w:cs="Times New Roman" w:hint="default"/>
+        <w:b/>
+      </w:rPr>
+    </w:lvl>
+    <w:lvl w:ilvl="1" w:tplc="04090003" w:tentative="1">
+      <w:start w:val="1"/>
+      <w:numFmt w:val="bullet"/>
+      <w:lvlText w:val="o"/>
+      <w:lvlJc w:val="left"/>
+      <w:pPr>
+        <w:ind w:left="1800" w:hanging="360"/>
+      </w:pPr>
+      <w:rPr>
+        <w:rFonts w:ascii="Courier New" w:hAnsi="Courier New" w:cs="Courier New" w:hint="default"/>
+      </w:rPr>
+    </w:lvl>
+    <w:lvl w:ilvl="2" w:tplc="04090005" w:tentative="1">
+      <w:start w:val="1"/>
+      <w:numFmt w:val="bullet"/>
+      <w:lvlText w:val=""/>
+      <w:lvlJc w:val="left"/>
+      <w:pPr>
+        <w:ind w:left="2520" w:hanging="360"/>
+      </w:pPr>
+      <w:rPr>
+        <w:rFonts w:ascii="Wingdings" w:hAnsi="Wingdings" w:hint="default"/>
+      </w:rPr>
+    </w:lvl>
+    <w:lvl w:ilvl="3" w:tplc="04090001" w:tentative="1">
+      <w:start w:val="1"/>
+      <w:numFmt w:val="bullet"/>
+      <w:lvlText w:val=""/>
+      <w:lvlJc w:val="left"/>
+      <w:pPr>
+        <w:ind w:left="3240" w:hanging="360"/>
+      </w:pPr>
+      <w:rPr>
+        <w:rFonts w:ascii="Symbol" w:hAnsi="Symbol" w:hint="default"/>
+      </w:rPr>
+    </w:lvl>
+    <w:lvl w:ilvl="4" w:tplc="04090003" w:tentative="1">
+      <w:start w:val="1"/>
+      <w:numFmt w:val="bullet"/>
+      <w:lvlText w:val="o"/>
+      <w:lvlJc w:val="left"/>
+      <w:pPr>
+        <w:ind w:left="3960" w:hanging="360"/>
+      </w:pPr>
+      <w:rPr>
+        <w:rFonts w:ascii="Courier New" w:hAnsi="Courier New" w:cs="Courier New" w:hint="default"/>
+      </w:rPr>
+    </w:lvl>
+    <w:lvl w:ilvl="5" w:tplc="04090005" w:tentative="1">
+      <w:start w:val="1"/>
+      <w:numFmt w:val="bullet"/>
+      <w:lvlText w:val=""/>
+      <w:lvlJc w:val="left"/>
+      <w:pPr>
+        <w:ind w:left="4680" w:hanging="360"/>
+      </w:pPr>
+      <w:rPr>
+        <w:rFonts w:ascii="Wingdings" w:hAnsi="Wingdings" w:hint="default"/>
+      </w:rPr>
+    </w:lvl>
+    <w:lvl w:ilvl="6" w:tplc="04090001" w:tentative="1">
+      <w:start w:val="1"/>
+      <w:numFmt w:val="bullet"/>
+      <w:lvlText w:val=""/>
+      <w:lvlJc w:val="left"/>
+      <w:pPr>
+        <w:ind w:left="5400" w:hanging="360"/>
+      </w:pPr>
+      <w:rPr>
+        <w:rFonts w:ascii="Symbol" w:hAnsi="Symbol" w:hint="default"/>
+      </w:rPr>
+    </w:lvl>
+    <w:lvl w:ilvl="7" w:tplc="04090003" w:tentative="1">
+      <w:start w:val="1"/>
+      <w:numFmt w:val="bullet"/>
+      <w:lvlText w:val="o"/>
+      <w:lvlJc w:val="left"/>
+      <w:pPr>
+        <w:ind w:left="6120" w:hanging="360"/>
+      </w:pPr>
+      <w:rPr>
+        <w:rFonts w:ascii="Courier New" w:hAnsi="Courier New" w:cs="Courier New" w:hint="default"/>
+      </w:rPr>
+    </w:lvl>
+    <w:lvl w:ilvl="8" w:tplc="04090005" w:tentative="1">
+      <w:start w:val="1"/>
+      <w:numFmt w:val="bullet"/>
+      <w:lvlText w:val=""/>
+      <w:lvlJc w:val="left"/>
+      <w:pPr>
+        <w:ind w:left="6840" w:hanging="360"/>
+      </w:pPr>
+      <w:rPr>
+        <w:rFonts w:ascii="Wingdings" w:hAnsi="Wingdings" w:hint="default"/>
+      </w:rPr>
+    </w:lvl>
+  </w:abstractNum>
+  <w:abstractNum w:abstractNumId="10" w15:restartNumberingAfterBreak="1">
     <w:nsid w:val="6C537C1B"/>
     <w:multiLevelType w:val="hybridMultilevel"/>
     <w:tmpl w:val="1AF8EE5A"/>
@@ -10747,7 +10776,7 @@
     </w:lvl>
   </w:abstractNum>
   <w:num w:numId="1" w16cid:durableId="1960061646">
-    <w:abstractNumId w:val="4"/>
+    <w:abstractNumId w:val="6"/>
   </w:num>
   <w:num w:numId="2" w16cid:durableId="1807238292">
     <w:abstractNumId w:val="0"/>
@@ -10756,16 +10785,28 @@
     <w:abstractNumId w:val="2"/>
   </w:num>
   <w:num w:numId="4" w16cid:durableId="1093739505">
-    <w:abstractNumId w:val="6"/>
+    <w:abstractNumId w:val="10"/>
   </w:num>
   <w:num w:numId="5" w16cid:durableId="788162051">
-    <w:abstractNumId w:val="3"/>
+    <w:abstractNumId w:val="4"/>
   </w:num>
   <w:num w:numId="6" w16cid:durableId="1389767226">
     <w:abstractNumId w:val="1"/>
   </w:num>
   <w:num w:numId="7" w16cid:durableId="739670358">
+    <w:abstractNumId w:val="7"/>
+  </w:num>
+  <w:num w:numId="8" w16cid:durableId="1908413860">
+    <w:abstractNumId w:val="9"/>
+  </w:num>
+  <w:num w:numId="9" w16cid:durableId="1150975319">
     <w:abstractNumId w:val="5"/>
+  </w:num>
+  <w:num w:numId="10" w16cid:durableId="545798535">
+    <w:abstractNumId w:val="3"/>
+  </w:num>
+  <w:num w:numId="11" w16cid:durableId="579171615">
+    <w:abstractNumId w:val="8"/>
   </w:num>
 </w:numbering>
 </file>
@@ -10823,6 +10864,12 @@
   <wne:recipientData>
     <wne:active wne:val="1"/>
     <wne:hash wne:val="1707048493"/>
+  </wne:recipientData>
+  <wne:recipientData>
+    <wne:active wne:val="1"/>
+  </wne:recipientData>
+  <wne:recipientData>
+    <wne:active wne:val="1"/>
   </wne:recipientData>
   <wne:recipientData>
     <wne:active wne:val="1"/>

</xml_diff>